<commit_message>
feat(algaktiv): update 6 authentic scenes, screenshots, Saigon dialogue voiceovers and new URL
</commit_message>
<xml_diff>
--- a/260826-DANH SACH CÁC APP WEB DA THUC HIEN.docx
+++ b/260826-DANH SACH CÁC APP WEB DA THUC HIEN.docx
@@ -504,19 +504,7 @@
           <w:rPr>
             <w:rStyle w:val="Hyperlink"/>
           </w:rPr>
-          <w:t>https://</w:t>
-        </w:r>
-        <w:r>
-          <w:rPr>
-            <w:rStyle w:val="Hyperlink"/>
-          </w:rPr>
-          <w:t>vanderbilt</w:t>
-        </w:r>
-        <w:r>
-          <w:rPr>
-            <w:rStyle w:val="Hyperlink"/>
-          </w:rPr>
-          <w:t>advisor.vercel.app</w:t>
+          <w:t>https://vanderbiltadvisor.vercel.app</w:t>
         </w:r>
       </w:hyperlink>
     </w:p>
@@ -550,17 +538,13 @@
     <w:p>
       <w:pPr>
         <w:pStyle w:val="ListParagraph"/>
-        <w:rPr>
-          <w:b/>
-          <w:bCs/>
-        </w:rPr>
       </w:pPr>
       <w:hyperlink r:id="rId19" w:history="1">
         <w:r>
           <w:rPr>
             <w:rStyle w:val="Hyperlink"/>
           </w:rPr>
-          <w:t>https://algaktiv-advisor.pages.dev/</w:t>
+          <w:t>https://algaktivadvisor.vercel.app</w:t>
         </w:r>
       </w:hyperlink>
     </w:p>
@@ -593,16 +577,26 @@
     </w:p>
     <w:p>
       <w:pPr>
+        <w:pStyle w:val="ListParagraph"/>
+      </w:pPr>
+      <w:hyperlink r:id="rId20" w:history="1">
+        <w:r>
+          <w:rPr>
+            <w:rStyle w:val="Hyperlink"/>
+          </w:rPr>
+          <w:t>https://Lanxessadvisor.vercel.app</w:t>
+        </w:r>
+      </w:hyperlink>
+    </w:p>
+    <w:p>
+      <w:pPr>
         <w:ind w:left="720" w:firstLine="720"/>
       </w:pPr>
-      <w:hyperlink r:id="rId20" w:history="1">
-        <w:r>
-          <w:rPr>
-            <w:rStyle w:val="Hyperlink"/>
-          </w:rPr>
-          <w:t>https://lanxess-cosmetic-advisor.pages.dev/</w:t>
-        </w:r>
-      </w:hyperlink>
+    </w:p>
+    <w:p>
+      <w:pPr>
+        <w:ind w:left="720" w:firstLine="720"/>
+      </w:pPr>
     </w:p>
     <w:p>
       <w:pPr>
@@ -849,14 +843,21 @@
     <w:p>
       <w:pPr>
         <w:pStyle w:val="ListParagraph"/>
-      </w:pPr>
-      <w:r>
+        <w:rPr>
+          <w:lang w:val="de-CH"/>
+        </w:rPr>
+      </w:pPr>
+      <w:r>
+        <w:rPr>
+          <w:lang w:val="de-CH"/>
+        </w:rPr>
         <w:t>link phu:  </w:t>
       </w:r>
       <w:hyperlink r:id="rId26" w:history="1">
         <w:r>
           <w:rPr>
             <w:rStyle w:val="Hyperlink"/>
+            <w:lang w:val="de-CH"/>
           </w:rPr>
           <w:t>https://duy-anh-digital-lab.vercel.app</w:t>
         </w:r>
@@ -872,12 +873,14 @@
         <w:rPr>
           <w:b/>
           <w:bCs/>
-        </w:rPr>
-      </w:pPr>
-      <w:r>
-        <w:rPr>
-          <w:b/>
-          <w:bCs/>
+          <w:lang w:val="de-CH"/>
+        </w:rPr>
+      </w:pPr>
+      <w:r>
+        <w:rPr>
+          <w:b/>
+          <w:bCs/>
+          <w:lang w:val="de-CH"/>
         </w:rPr>
         <w:t>APP WEB BÁO CÁO THUẾ HỘ KINH DOANH</w:t>
       </w:r>
@@ -1096,6 +1099,67 @@
             <w:rStyle w:val="Hyperlink"/>
           </w:rPr>
           <w:t>tropilab.vercel.app</w:t>
+        </w:r>
+      </w:hyperlink>
+    </w:p>
+    <w:p>
+      <w:pPr>
+        <w:pStyle w:val="ListParagraph"/>
+        <w:numPr>
+          <w:ilvl w:val="0"/>
+          <w:numId w:val="1"/>
+        </w:numPr>
+        <w:rPr>
+          <w:b/>
+          <w:bCs/>
+          <w:lang w:val="de-CH"/>
+        </w:rPr>
+      </w:pPr>
+      <w:r>
+        <w:rPr>
+          <w:b/>
+          <w:bCs/>
+          <w:lang w:val="de-CH"/>
+        </w:rPr>
+        <w:t>WEB LANDING PAGE QUANG CAO ƯNG DU</w:t>
+      </w:r>
+      <w:r>
+        <w:rPr>
+          <w:b/>
+          <w:bCs/>
+          <w:lang w:val="de-CH"/>
+        </w:rPr>
+        <w:t>NG</w:t>
+      </w:r>
+    </w:p>
+    <w:p>
+      <w:pPr>
+        <w:pStyle w:val="ListParagraph"/>
+        <w:rPr>
+          <w:lang w:val="de-CH"/>
+        </w:rPr>
+      </w:pPr>
+      <w:hyperlink r:id="rId34" w:history="1">
+        <w:r>
+          <w:rPr>
+            <w:rStyle w:val="Hyperlink"/>
+            <w:lang w:val="de-CH"/>
+          </w:rPr>
+          <w:t>https://</w:t>
+        </w:r>
+        <w:r>
+          <w:rPr>
+            <w:rStyle w:val="Hyperlink"/>
+            <w:lang w:val="de-CH"/>
+          </w:rPr>
+          <w:t>lamchame</w:t>
+        </w:r>
+        <w:r>
+          <w:rPr>
+            <w:rStyle w:val="Hyperlink"/>
+            <w:lang w:val="de-CH"/>
+          </w:rPr>
+          <w:t>.vercel.app/</w:t>
         </w:r>
       </w:hyperlink>
     </w:p>

</xml_diff>

<commit_message>
feat(badminton): update 9 authentic scenes, images, sports dialogue voiceovers with court ambience
</commit_message>
<xml_diff>
--- a/260826-DANH SACH CÁC APP WEB DA THUC HIEN.docx
+++ b/260826-DANH SACH CÁC APP WEB DA THUC HIEN.docx
@@ -21,8 +21,9 @@
           <w:sz w:val="38"/>
           <w:szCs w:val="38"/>
         </w:rPr>
-        <w:t xml:space="preserve">DANH SÁCH  </w:t>
-      </w:r>
+        <w:t xml:space="preserve">DANH </w:t>
+      </w:r>
+      <w:proofErr w:type="gramStart"/>
       <w:r>
         <w:rPr>
           <w:b/>
@@ -31,7 +32,28 @@
           <w:sz w:val="38"/>
           <w:szCs w:val="38"/>
         </w:rPr>
-        <w:t>CÁC APP-WEB ĐÃ THỰC HIỆN</w:t>
+        <w:t xml:space="preserve">SÁCH  </w:t>
+      </w:r>
+      <w:r>
+        <w:rPr>
+          <w:b/>
+          <w:bCs/>
+          <w:color w:val="EE0000"/>
+          <w:sz w:val="38"/>
+          <w:szCs w:val="38"/>
+        </w:rPr>
+        <w:t>CÁC</w:t>
+      </w:r>
+      <w:proofErr w:type="gramEnd"/>
+      <w:r>
+        <w:rPr>
+          <w:b/>
+          <w:bCs/>
+          <w:color w:val="EE0000"/>
+          <w:sz w:val="38"/>
+          <w:szCs w:val="38"/>
+        </w:rPr>
+        <w:t xml:space="preserve"> APP-WEB ĐÃ THỰC HIỆN</w:t>
       </w:r>
     </w:p>
     <w:p>
@@ -104,7 +126,23 @@
           <w:b/>
           <w:bCs/>
         </w:rPr>
-        <w:t>APP WEB THEO DÕI QUẢN LÝ SALES  ĐI THĂM KHÁCH HÀNG</w:t>
+        <w:t xml:space="preserve">APP WEB THEO DÕI QUẢN LÝ </w:t>
+      </w:r>
+      <w:proofErr w:type="gramStart"/>
+      <w:r>
+        <w:rPr>
+          <w:b/>
+          <w:bCs/>
+        </w:rPr>
+        <w:t>SALES  ĐI</w:t>
+      </w:r>
+      <w:proofErr w:type="gramEnd"/>
+      <w:r>
+        <w:rPr>
+          <w:b/>
+          <w:bCs/>
+        </w:rPr>
+        <w:t xml:space="preserve"> THĂM KHÁCH HÀNG</w:t>
       </w:r>
     </w:p>
     <w:p>
@@ -615,14 +653,30 @@
           <w:b/>
           <w:bCs/>
         </w:rPr>
-        <w:t xml:space="preserve">APP WEB </w:t>
-      </w:r>
-      <w:r>
-        <w:rPr>
-          <w:b/>
-          <w:bCs/>
-        </w:rPr>
-        <w:t xml:space="preserve"> TAP DA LIEU &amp; LAM MỸ PHẨM </w:t>
+        <w:t xml:space="preserve">APP </w:t>
+      </w:r>
+      <w:proofErr w:type="gramStart"/>
+      <w:r>
+        <w:rPr>
+          <w:b/>
+          <w:bCs/>
+        </w:rPr>
+        <w:t xml:space="preserve">WEB </w:t>
+      </w:r>
+      <w:r>
+        <w:rPr>
+          <w:b/>
+          <w:bCs/>
+        </w:rPr>
+        <w:t xml:space="preserve"> TAP</w:t>
+      </w:r>
+      <w:proofErr w:type="gramEnd"/>
+      <w:r>
+        <w:rPr>
+          <w:b/>
+          <w:bCs/>
+        </w:rPr>
+        <w:t xml:space="preserve"> DA LIEU &amp; LAM MỸ PHẨM </w:t>
       </w:r>
       <w:r>
         <w:rPr>
@@ -853,15 +907,28 @@
         </w:rPr>
         <w:t>link phu:  </w:t>
       </w:r>
-      <w:hyperlink r:id="rId26" w:history="1">
-        <w:r>
-          <w:rPr>
-            <w:rStyle w:val="Hyperlink"/>
-            <w:lang w:val="de-CH"/>
-          </w:rPr>
-          <w:t>https://duy-anh-digital-lab.vercel.app</w:t>
-        </w:r>
-      </w:hyperlink>
+      <w:r>
+        <w:fldChar w:fldCharType="begin"/>
+      </w:r>
+      <w:r>
+        <w:rPr>
+          <w:lang w:val="de-CH"/>
+        </w:rPr>
+        <w:instrText>HYPERLINK "https://duy-anh-digital-lab.vercel.app/"</w:instrText>
+      </w:r>
+      <w:r>
+        <w:fldChar w:fldCharType="separate"/>
+      </w:r>
+      <w:r>
+        <w:rPr>
+          <w:rStyle w:val="Hyperlink"/>
+          <w:lang w:val="de-CH"/>
+        </w:rPr>
+        <w:t>https://duy-anh-digital-lab.vercel.app</w:t>
+      </w:r>
+      <w:r>
+        <w:fldChar w:fldCharType="end"/>
+      </w:r>
     </w:p>
     <w:p>
       <w:pPr>
@@ -889,7 +956,7 @@
       <w:pPr>
         <w:pStyle w:val="ListParagraph"/>
       </w:pPr>
-      <w:hyperlink r:id="rId27" w:history="1">
+      <w:hyperlink r:id="rId26" w:history="1">
         <w:r>
           <w:rPr>
             <w:rStyle w:val="Hyperlink"/>
@@ -922,7 +989,7 @@
       <w:pPr>
         <w:pStyle w:val="ListParagraph"/>
       </w:pPr>
-      <w:hyperlink r:id="rId28" w:history="1">
+      <w:hyperlink r:id="rId27" w:history="1">
         <w:r>
           <w:rPr>
             <w:rStyle w:val="Hyperlink"/>
@@ -955,7 +1022,7 @@
       <w:pPr>
         <w:pStyle w:val="ListParagraph"/>
       </w:pPr>
-      <w:hyperlink r:id="rId29" w:history="1">
+      <w:hyperlink r:id="rId28" w:history="1">
         <w:r>
           <w:rPr>
             <w:rStyle w:val="Hyperlink"/>
@@ -988,7 +1055,7 @@
       <w:pPr>
         <w:pStyle w:val="ListParagraph"/>
       </w:pPr>
-      <w:hyperlink r:id="rId30" w:history="1">
+      <w:hyperlink r:id="rId29" w:history="1">
         <w:r>
           <w:rPr>
             <w:rStyle w:val="Hyperlink"/>
@@ -1021,7 +1088,7 @@
       <w:pPr>
         <w:pStyle w:val="ListParagraph"/>
       </w:pPr>
-      <w:hyperlink r:id="rId31" w:history="1">
+      <w:hyperlink r:id="rId30" w:history="1">
         <w:r>
           <w:rPr>
             <w:rStyle w:val="Hyperlink"/>
@@ -1054,7 +1121,7 @@
       <w:pPr>
         <w:pStyle w:val="ListParagraph"/>
       </w:pPr>
-      <w:hyperlink r:id="rId32" w:history="1">
+      <w:hyperlink r:id="rId31" w:history="1">
         <w:r>
           <w:rPr>
             <w:rStyle w:val="Hyperlink"/>
@@ -1080,14 +1147,62 @@
           <w:b/>
           <w:bCs/>
         </w:rPr>
-        <w:t>APP QUẢN TRỊ RỦI RO XÉT NGHIỆM BỆNH VIỆN CHUẨN ISO 22367:2020, ISO 35001, GLP và Quyết định 2429/QĐ-BYT1731.</w:t>
-      </w:r>
-    </w:p>
-    <w:p>
-      <w:pPr>
-        <w:pStyle w:val="ListParagraph"/>
-      </w:pPr>
-      <w:hyperlink r:id="rId33" w:history="1">
+        <w:t xml:space="preserve">APP QUẢN TRỊ RỦI RO XÉT NGHIỆM BỆNH VIỆN CHUẨN ISO 22367:2020, ISO 35001, GLP </w:t>
+      </w:r>
+      <w:proofErr w:type="spellStart"/>
+      <w:r>
+        <w:rPr>
+          <w:b/>
+          <w:bCs/>
+        </w:rPr>
+        <w:t>và</w:t>
+      </w:r>
+      <w:proofErr w:type="spellEnd"/>
+      <w:r>
+        <w:rPr>
+          <w:b/>
+          <w:bCs/>
+        </w:rPr>
+        <w:t xml:space="preserve"> </w:t>
+      </w:r>
+      <w:proofErr w:type="spellStart"/>
+      <w:r>
+        <w:rPr>
+          <w:b/>
+          <w:bCs/>
+        </w:rPr>
+        <w:t>Quyết</w:t>
+      </w:r>
+      <w:proofErr w:type="spellEnd"/>
+      <w:r>
+        <w:rPr>
+          <w:b/>
+          <w:bCs/>
+        </w:rPr>
+        <w:t xml:space="preserve"> </w:t>
+      </w:r>
+      <w:proofErr w:type="spellStart"/>
+      <w:r>
+        <w:rPr>
+          <w:b/>
+          <w:bCs/>
+        </w:rPr>
+        <w:t>định</w:t>
+      </w:r>
+      <w:proofErr w:type="spellEnd"/>
+      <w:r>
+        <w:rPr>
+          <w:b/>
+          <w:bCs/>
+        </w:rPr>
+        <w:t xml:space="preserve"> 2429/QĐ-BYT1731.</w:t>
+      </w:r>
+    </w:p>
+    <w:p>
+      <w:pPr>
+        <w:pStyle w:val="ListParagraph"/>
+      </w:pPr>
+      <w:hyperlink r:id="rId32" w:history="1">
         <w:r>
           <w:rPr>
             <w:rStyle w:val="Hyperlink"/>
@@ -1139,7 +1254,7 @@
           <w:lang w:val="de-CH"/>
         </w:rPr>
       </w:pPr>
-      <w:hyperlink r:id="rId34" w:history="1">
+      <w:hyperlink r:id="rId33" w:history="1">
         <w:r>
           <w:rPr>
             <w:rStyle w:val="Hyperlink"/>

</xml_diff>

<commit_message>
feat: Add Vietreal 360 Vietnamese learning ecosystem with bilingual interactive dialogue audio, 8 country editions, and update app catalog to 25+
</commit_message>
<xml_diff>
--- a/260826-DANH SACH CÁC APP WEB DA THUC HIEN.docx
+++ b/260826-DANH SACH CÁC APP WEB DA THUC HIEN.docx
@@ -21,9 +21,8 @@
           <w:sz w:val="38"/>
           <w:szCs w:val="38"/>
         </w:rPr>
-        <w:t xml:space="preserve">DANH </w:t>
-      </w:r>
-      <w:proofErr w:type="gramStart"/>
+        <w:t xml:space="preserve">DANH SÁCH  </w:t>
+      </w:r>
       <w:r>
         <w:rPr>
           <w:b/>
@@ -32,28 +31,7 @@
           <w:sz w:val="38"/>
           <w:szCs w:val="38"/>
         </w:rPr>
-        <w:t xml:space="preserve">SÁCH  </w:t>
-      </w:r>
-      <w:r>
-        <w:rPr>
-          <w:b/>
-          <w:bCs/>
-          <w:color w:val="EE0000"/>
-          <w:sz w:val="38"/>
-          <w:szCs w:val="38"/>
-        </w:rPr>
-        <w:t>CÁC</w:t>
-      </w:r>
-      <w:proofErr w:type="gramEnd"/>
-      <w:r>
-        <w:rPr>
-          <w:b/>
-          <w:bCs/>
-          <w:color w:val="EE0000"/>
-          <w:sz w:val="38"/>
-          <w:szCs w:val="38"/>
-        </w:rPr>
-        <w:t xml:space="preserve"> APP-WEB ĐÃ THỰC HIỆN</w:t>
+        <w:t>CÁC APP-WEB ĐÃ THỰC HIỆN</w:t>
       </w:r>
     </w:p>
     <w:p>
@@ -126,23 +104,7 @@
           <w:b/>
           <w:bCs/>
         </w:rPr>
-        <w:t xml:space="preserve">APP WEB THEO DÕI QUẢN LÝ </w:t>
-      </w:r>
-      <w:proofErr w:type="gramStart"/>
-      <w:r>
-        <w:rPr>
-          <w:b/>
-          <w:bCs/>
-        </w:rPr>
-        <w:t>SALES  ĐI</w:t>
-      </w:r>
-      <w:proofErr w:type="gramEnd"/>
-      <w:r>
-        <w:rPr>
-          <w:b/>
-          <w:bCs/>
-        </w:rPr>
-        <w:t xml:space="preserve"> THĂM KHÁCH HÀNG</w:t>
+        <w:t>APP WEB THEO DÕI QUẢN LÝ SALES  ĐI THĂM KHÁCH HÀNG</w:t>
       </w:r>
     </w:p>
     <w:p>
@@ -653,30 +615,14 @@
           <w:b/>
           <w:bCs/>
         </w:rPr>
-        <w:t xml:space="preserve">APP </w:t>
-      </w:r>
-      <w:proofErr w:type="gramStart"/>
-      <w:r>
-        <w:rPr>
-          <w:b/>
-          <w:bCs/>
-        </w:rPr>
-        <w:t xml:space="preserve">WEB </w:t>
-      </w:r>
-      <w:r>
-        <w:rPr>
-          <w:b/>
-          <w:bCs/>
-        </w:rPr>
-        <w:t xml:space="preserve"> TAP</w:t>
-      </w:r>
-      <w:proofErr w:type="gramEnd"/>
-      <w:r>
-        <w:rPr>
-          <w:b/>
-          <w:bCs/>
-        </w:rPr>
-        <w:t xml:space="preserve"> DA LIEU &amp; LAM MỸ PHẨM </w:t>
+        <w:t xml:space="preserve">APP WEB </w:t>
+      </w:r>
+      <w:r>
+        <w:rPr>
+          <w:b/>
+          <w:bCs/>
+        </w:rPr>
+        <w:t xml:space="preserve"> TAP DA LIEU &amp; LAM MỸ PHẨM </w:t>
       </w:r>
       <w:r>
         <w:rPr>
@@ -897,38 +843,26 @@
     <w:p>
       <w:pPr>
         <w:pStyle w:val="ListParagraph"/>
-        <w:rPr>
-          <w:lang w:val="de-CH"/>
-        </w:rPr>
-      </w:pPr>
-      <w:r>
-        <w:rPr>
-          <w:lang w:val="de-CH"/>
-        </w:rPr>
-        <w:t>link phu:  </w:t>
-      </w:r>
-      <w:r>
-        <w:fldChar w:fldCharType="begin"/>
-      </w:r>
-      <w:r>
-        <w:rPr>
-          <w:lang w:val="de-CH"/>
-        </w:rPr>
-        <w:instrText>HYPERLINK "https://duy-anh-digital-lab.vercel.app/"</w:instrText>
-      </w:r>
-      <w:r>
-        <w:fldChar w:fldCharType="separate"/>
-      </w:r>
-      <w:r>
-        <w:rPr>
-          <w:rStyle w:val="Hyperlink"/>
-          <w:lang w:val="de-CH"/>
-        </w:rPr>
-        <w:t>https://duy-anh-digital-lab.vercel.app</w:t>
-      </w:r>
-      <w:r>
-        <w:fldChar w:fldCharType="end"/>
-      </w:r>
+      </w:pPr>
+      <w:r>
+        <w:t xml:space="preserve">link </w:t>
+      </w:r>
+      <w:proofErr w:type="spellStart"/>
+      <w:r>
+        <w:t>phu</w:t>
+      </w:r>
+      <w:proofErr w:type="spellEnd"/>
+      <w:r>
+        <w:t>:  </w:t>
+      </w:r>
+      <w:hyperlink r:id="rId26" w:history="1">
+        <w:r>
+          <w:rPr>
+            <w:rStyle w:val="Hyperlink"/>
+          </w:rPr>
+          <w:t>https://duy-anh-digital-lab.vercel.app</w:t>
+        </w:r>
+      </w:hyperlink>
     </w:p>
     <w:p>
       <w:pPr>
@@ -940,14 +874,12 @@
         <w:rPr>
           <w:b/>
           <w:bCs/>
-          <w:lang w:val="de-CH"/>
-        </w:rPr>
-      </w:pPr>
-      <w:r>
-        <w:rPr>
-          <w:b/>
-          <w:bCs/>
-          <w:lang w:val="de-CH"/>
+        </w:rPr>
+      </w:pPr>
+      <w:r>
+        <w:rPr>
+          <w:b/>
+          <w:bCs/>
         </w:rPr>
         <w:t>APP WEB BÁO CÁO THUẾ HỘ KINH DOANH</w:t>
       </w:r>
@@ -956,7 +888,7 @@
       <w:pPr>
         <w:pStyle w:val="ListParagraph"/>
       </w:pPr>
-      <w:hyperlink r:id="rId26" w:history="1">
+      <w:hyperlink r:id="rId27" w:history="1">
         <w:r>
           <w:rPr>
             <w:rStyle w:val="Hyperlink"/>
@@ -989,7 +921,7 @@
       <w:pPr>
         <w:pStyle w:val="ListParagraph"/>
       </w:pPr>
-      <w:hyperlink r:id="rId27" w:history="1">
+      <w:hyperlink r:id="rId28" w:history="1">
         <w:r>
           <w:rPr>
             <w:rStyle w:val="Hyperlink"/>
@@ -1022,7 +954,7 @@
       <w:pPr>
         <w:pStyle w:val="ListParagraph"/>
       </w:pPr>
-      <w:hyperlink r:id="rId28" w:history="1">
+      <w:hyperlink r:id="rId29" w:history="1">
         <w:r>
           <w:rPr>
             <w:rStyle w:val="Hyperlink"/>
@@ -1055,7 +987,7 @@
       <w:pPr>
         <w:pStyle w:val="ListParagraph"/>
       </w:pPr>
-      <w:hyperlink r:id="rId29" w:history="1">
+      <w:hyperlink r:id="rId30" w:history="1">
         <w:r>
           <w:rPr>
             <w:rStyle w:val="Hyperlink"/>
@@ -1088,7 +1020,7 @@
       <w:pPr>
         <w:pStyle w:val="ListParagraph"/>
       </w:pPr>
-      <w:hyperlink r:id="rId30" w:history="1">
+      <w:hyperlink r:id="rId31" w:history="1">
         <w:r>
           <w:rPr>
             <w:rStyle w:val="Hyperlink"/>
@@ -1121,7 +1053,7 @@
       <w:pPr>
         <w:pStyle w:val="ListParagraph"/>
       </w:pPr>
-      <w:hyperlink r:id="rId31" w:history="1">
+      <w:hyperlink r:id="rId32" w:history="1">
         <w:r>
           <w:rPr>
             <w:rStyle w:val="Hyperlink"/>
@@ -1202,7 +1134,7 @@
       <w:pPr>
         <w:pStyle w:val="ListParagraph"/>
       </w:pPr>
-      <w:hyperlink r:id="rId32" w:history="1">
+      <w:hyperlink r:id="rId33" w:history="1">
         <w:r>
           <w:rPr>
             <w:rStyle w:val="Hyperlink"/>
@@ -1227,34 +1159,152 @@
         <w:rPr>
           <w:b/>
           <w:bCs/>
+        </w:rPr>
+      </w:pPr>
+      <w:r>
+        <w:rPr>
+          <w:b/>
+          <w:bCs/>
+        </w:rPr>
+        <w:t xml:space="preserve">WEB LANDING PAGE </w:t>
+      </w:r>
+      <w:r>
+        <w:rPr>
+          <w:b/>
+          <w:bCs/>
+        </w:rPr>
+        <w:t>QUẢNG CÁO ỨNG DỤN</w:t>
+      </w:r>
+      <w:r>
+        <w:rPr>
+          <w:b/>
+          <w:bCs/>
+        </w:rPr>
+        <w:t>G LÀM CHA MẸ</w:t>
+      </w:r>
+    </w:p>
+    <w:p>
+      <w:pPr>
+        <w:pStyle w:val="ListParagraph"/>
+        <w:rPr>
           <w:lang w:val="de-CH"/>
         </w:rPr>
       </w:pPr>
-      <w:r>
+      <w:hyperlink r:id="rId34" w:history="1">
+        <w:r>
+          <w:rPr>
+            <w:rStyle w:val="Hyperlink"/>
+            <w:lang w:val="de-CH"/>
+          </w:rPr>
+          <w:t>https://lamchame.vercel.app/</w:t>
+        </w:r>
+      </w:hyperlink>
+    </w:p>
+    <w:p>
+      <w:pPr>
+        <w:pStyle w:val="ListParagraph"/>
+        <w:numPr>
+          <w:ilvl w:val="0"/>
+          <w:numId w:val="1"/>
+        </w:numPr>
         <w:rPr>
           <w:b/>
           <w:bCs/>
           <w:lang w:val="de-CH"/>
         </w:rPr>
-        <w:t>WEB LANDING PAGE QUANG CAO ƯNG DU</w:t>
-      </w:r>
+      </w:pPr>
       <w:r>
         <w:rPr>
           <w:b/>
           <w:bCs/>
           <w:lang w:val="de-CH"/>
         </w:rPr>
-        <w:t>NG</w:t>
-      </w:r>
-    </w:p>
-    <w:p>
-      <w:pPr>
-        <w:pStyle w:val="ListParagraph"/>
-        <w:rPr>
+        <w:t>APP DAY T</w:t>
+      </w:r>
+      <w:r>
+        <w:rPr>
+          <w:b/>
+          <w:bCs/>
           <w:lang w:val="de-CH"/>
         </w:rPr>
-      </w:pPr>
-      <w:hyperlink r:id="rId33" w:history="1">
+        <w:t>IẾNG VIỆT CHO NGƯỜI NƯỚC N</w:t>
+      </w:r>
+      <w:r>
+        <w:rPr>
+          <w:b/>
+          <w:bCs/>
+          <w:lang w:val="de-CH"/>
+        </w:rPr>
+        <w:t>GOÀI</w:t>
+      </w:r>
+    </w:p>
+    <w:p>
+      <w:pPr>
+        <w:pStyle w:val="ListParagraph"/>
+      </w:pPr>
+      <w:hyperlink r:id="rId35" w:history="1">
+        <w:r>
+          <w:rPr>
+            <w:rStyle w:val="Hyperlink"/>
+          </w:rPr>
+          <w:t>https://</w:t>
+        </w:r>
+        <w:r>
+          <w:rPr>
+            <w:rStyle w:val="Hyperlink"/>
+          </w:rPr>
+          <w:t>vietreal</w:t>
+        </w:r>
+        <w:r>
+          <w:rPr>
+            <w:rStyle w:val="Hyperlink"/>
+          </w:rPr>
+          <w:t>.vercel.app/</w:t>
+        </w:r>
+      </w:hyperlink>
+    </w:p>
+    <w:p>
+      <w:pPr>
+        <w:pStyle w:val="ListParagraph"/>
+        <w:numPr>
+          <w:ilvl w:val="0"/>
+          <w:numId w:val="1"/>
+        </w:numPr>
+        <w:rPr>
+          <w:b/>
+          <w:bCs/>
+        </w:rPr>
+      </w:pPr>
+      <w:r>
+        <w:rPr>
+          <w:b/>
+          <w:bCs/>
+        </w:rPr>
+        <w:t xml:space="preserve">APP </w:t>
+      </w:r>
+      <w:r>
+        <w:rPr>
+          <w:b/>
+          <w:bCs/>
+        </w:rPr>
+        <w:t>NGƯỜI NHẬT HỌC T</w:t>
+      </w:r>
+      <w:r>
+        <w:rPr>
+          <w:b/>
+          <w:bCs/>
+        </w:rPr>
+        <w:t>IẾNG VIỆT</w:t>
+      </w:r>
+    </w:p>
+    <w:p>
+      <w:pPr>
+        <w:pStyle w:val="ListParagraph"/>
+        <w:rPr>
+          <w:lang w:val="de-CH"/>
+        </w:rPr>
+      </w:pPr>
+      <w:hyperlink r:id="rId36" w:history="1">
         <w:r>
           <w:rPr>
             <w:rStyle w:val="Hyperlink"/>
@@ -1265,9 +1315,8 @@
         <w:r>
           <w:rPr>
             <w:rStyle w:val="Hyperlink"/>
-            <w:lang w:val="de-CH"/>
-          </w:rPr>
-          <w:t>lamchame</w:t>
+          </w:rPr>
+          <w:t>betonavi</w:t>
         </w:r>
         <w:r>
           <w:rPr>
@@ -2145,7 +2194,6 @@
   <w:style w:type="character" w:default="1" w:styleId="DefaultParagraphFont">
     <w:name w:val="Default Paragraph Font"/>
     <w:uiPriority w:val="1"/>
-    <w:semiHidden/>
     <w:unhideWhenUsed/>
   </w:style>
   <w:style w:type="table" w:default="1" w:styleId="TableNormal">

</xml_diff>

<commit_message>
feat: tich hop ung dung moi Hom Nay An Gi (https://vietnuti.vercel.app) len landing page ungdung.vercel.app
</commit_message>
<xml_diff>
--- a/260826-DANH SACH CÁC APP WEB DA THUC HIEN.docx
+++ b/260826-DANH SACH CÁC APP WEB DA THUC HIEN.docx
@@ -845,15 +845,7 @@
         <w:pStyle w:val="ListParagraph"/>
       </w:pPr>
       <w:r>
-        <w:t xml:space="preserve">link </w:t>
-      </w:r>
-      <w:proofErr w:type="spellStart"/>
-      <w:r>
-        <w:t>phu</w:t>
-      </w:r>
-      <w:proofErr w:type="spellEnd"/>
-      <w:r>
-        <w:t>:  </w:t>
+        <w:t>link phu:  </w:t>
       </w:r>
       <w:hyperlink r:id="rId26" w:history="1">
         <w:r>
@@ -1079,65 +1071,708 @@
           <w:b/>
           <w:bCs/>
         </w:rPr>
-        <w:t xml:space="preserve">APP QUẢN TRỊ RỦI RO XÉT NGHIỆM BỆNH VIỆN CHUẨN ISO 22367:2020, ISO 35001, GLP </w:t>
-      </w:r>
-      <w:proofErr w:type="spellStart"/>
-      <w:r>
-        <w:rPr>
-          <w:b/>
-          <w:bCs/>
-        </w:rPr>
-        <w:t>và</w:t>
-      </w:r>
-      <w:proofErr w:type="spellEnd"/>
-      <w:r>
-        <w:rPr>
-          <w:b/>
-          <w:bCs/>
+        <w:t>APP QUẢN TRỊ RỦI RO XÉT NGHIỆM BỆNH VIỆN CHUẨN ISO 22367:2020, ISO 35001, GLP và Quyết định 2429/QĐ-BYT1731.</w:t>
+      </w:r>
+    </w:p>
+    <w:p>
+      <w:pPr>
+        <w:pStyle w:val="ListParagraph"/>
+      </w:pPr>
+      <w:hyperlink r:id="rId33" w:history="1">
+        <w:r>
+          <w:rPr>
+            <w:rStyle w:val="Hyperlink"/>
+          </w:rPr>
+          <w:t>https://</w:t>
+        </w:r>
+        <w:r>
+          <w:rPr>
+            <w:rStyle w:val="Hyperlink"/>
+          </w:rPr>
+          <w:t>tropilab.vercel.app</w:t>
+        </w:r>
+      </w:hyperlink>
+    </w:p>
+    <w:p>
+      <w:pPr>
+        <w:pStyle w:val="ListParagraph"/>
+        <w:numPr>
+          <w:ilvl w:val="0"/>
+          <w:numId w:val="1"/>
+        </w:numPr>
+        <w:rPr>
+          <w:b/>
+          <w:bCs/>
+        </w:rPr>
+      </w:pPr>
+      <w:r>
+        <w:rPr>
+          <w:b/>
+          <w:bCs/>
+        </w:rPr>
+        <w:t xml:space="preserve">WEB LANDING PAGE </w:t>
+      </w:r>
+      <w:r>
+        <w:rPr>
+          <w:b/>
+          <w:bCs/>
+        </w:rPr>
+        <w:t>QUẢNG CÁO ỨNG DỤN</w:t>
+      </w:r>
+      <w:r>
+        <w:rPr>
+          <w:b/>
+          <w:bCs/>
+        </w:rPr>
+        <w:t>G LÀM CHA MẸ</w:t>
+      </w:r>
+    </w:p>
+    <w:p>
+      <w:pPr>
+        <w:pStyle w:val="ListParagraph"/>
+        <w:rPr>
+          <w:lang w:val="de-CH"/>
+        </w:rPr>
+      </w:pPr>
+      <w:hyperlink r:id="rId34" w:history="1">
+        <w:r>
+          <w:rPr>
+            <w:rStyle w:val="Hyperlink"/>
+            <w:lang w:val="de-CH"/>
+          </w:rPr>
+          <w:t>https://lamchame.vercel.app/</w:t>
+        </w:r>
+      </w:hyperlink>
+    </w:p>
+    <w:p>
+      <w:pPr>
+        <w:pStyle w:val="ListParagraph"/>
+        <w:numPr>
+          <w:ilvl w:val="0"/>
+          <w:numId w:val="1"/>
+        </w:numPr>
+        <w:rPr>
+          <w:b/>
+          <w:bCs/>
+          <w:lang w:val="de-CH"/>
+        </w:rPr>
+      </w:pPr>
+      <w:r>
+        <w:rPr>
+          <w:b/>
+          <w:bCs/>
+          <w:lang w:val="de-CH"/>
+        </w:rPr>
+        <w:t>APP DAY T</w:t>
+      </w:r>
+      <w:r>
+        <w:rPr>
+          <w:b/>
+          <w:bCs/>
+          <w:lang w:val="de-CH"/>
+        </w:rPr>
+        <w:t>IẾNG VIỆT CHO NGƯỜI NƯỚC N</w:t>
+      </w:r>
+      <w:r>
+        <w:rPr>
+          <w:b/>
+          <w:bCs/>
+          <w:lang w:val="de-CH"/>
+        </w:rPr>
+        <w:t>GOÀI</w:t>
+      </w:r>
+    </w:p>
+    <w:p>
+      <w:pPr>
+        <w:pStyle w:val="ListParagraph"/>
+      </w:pPr>
+      <w:hyperlink r:id="rId35" w:history="1">
+        <w:r>
+          <w:rPr>
+            <w:rStyle w:val="Hyperlink"/>
+          </w:rPr>
+          <w:t>https://vietreal.vercel.app/</w:t>
+        </w:r>
+      </w:hyperlink>
+    </w:p>
+    <w:p>
+      <w:pPr>
+        <w:pStyle w:val="ListParagraph"/>
+        <w:numPr>
+          <w:ilvl w:val="0"/>
+          <w:numId w:val="1"/>
+        </w:numPr>
+        <w:rPr>
+          <w:b/>
+          <w:bCs/>
+        </w:rPr>
+      </w:pPr>
+      <w:r>
+        <w:rPr>
+          <w:b/>
+          <w:bCs/>
+        </w:rPr>
+        <w:t xml:space="preserve">APP </w:t>
+      </w:r>
+      <w:r>
+        <w:rPr>
+          <w:b/>
+          <w:bCs/>
+        </w:rPr>
+        <w:t>NGƯỜI NHẬT HỌC T</w:t>
+      </w:r>
+      <w:r>
+        <w:rPr>
+          <w:b/>
+          <w:bCs/>
+        </w:rPr>
+        <w:t>IẾNG VIỆT</w:t>
+      </w:r>
+    </w:p>
+    <w:p>
+      <w:pPr>
+        <w:pStyle w:val="ListParagraph"/>
+        <w:rPr>
+          <w:lang w:val="de-CH"/>
+        </w:rPr>
+      </w:pPr>
+      <w:hyperlink r:id="rId36" w:history="1">
+        <w:r>
+          <w:rPr>
+            <w:rStyle w:val="Hyperlink"/>
+            <w:lang w:val="de-CH"/>
+          </w:rPr>
+          <w:t>https://</w:t>
+        </w:r>
+        <w:r>
+          <w:rPr>
+            <w:rStyle w:val="Hyperlink"/>
+          </w:rPr>
+          <w:t>jpviet</w:t>
+        </w:r>
+        <w:r>
+          <w:rPr>
+            <w:rStyle w:val="Hyperlink"/>
+            <w:lang w:val="de-CH"/>
+          </w:rPr>
+          <w:t>.vercel.app/</w:t>
+        </w:r>
+      </w:hyperlink>
+    </w:p>
+    <w:p>
+      <w:pPr>
+        <w:pStyle w:val="ListParagraph"/>
+        <w:numPr>
+          <w:ilvl w:val="0"/>
+          <w:numId w:val="1"/>
+        </w:numPr>
+        <w:rPr>
+          <w:b/>
+          <w:bCs/>
+          <w:lang w:val="de-CH"/>
+        </w:rPr>
+      </w:pPr>
+      <w:r>
+        <w:rPr>
+          <w:b/>
+          <w:bCs/>
+          <w:lang w:val="de-CH"/>
+        </w:rPr>
+        <w:t xml:space="preserve">APP NGƯỜI </w:t>
+      </w:r>
+      <w:r>
+        <w:rPr>
+          <w:b/>
+          <w:bCs/>
+          <w:lang w:val="de-CH"/>
+        </w:rPr>
+        <w:t xml:space="preserve">THÁI </w:t>
+      </w:r>
+      <w:r>
+        <w:rPr>
+          <w:b/>
+          <w:bCs/>
+          <w:lang w:val="de-CH"/>
+        </w:rPr>
+        <w:t>HỌC TIẾNG VIỆT</w:t>
+      </w:r>
+    </w:p>
+    <w:p>
+      <w:pPr>
+        <w:pStyle w:val="ListParagraph"/>
+        <w:rPr>
+          <w:lang w:val="de-CH"/>
+        </w:rPr>
+      </w:pPr>
+      <w:hyperlink r:id="rId37" w:history="1">
+        <w:r>
+          <w:rPr>
+            <w:rStyle w:val="Hyperlink"/>
+            <w:lang w:val="de-CH"/>
+          </w:rPr>
+          <w:t>https://thviet.vercel.app</w:t>
+        </w:r>
+      </w:hyperlink>
+    </w:p>
+    <w:p>
+      <w:pPr>
+        <w:pStyle w:val="ListParagraph"/>
+        <w:numPr>
+          <w:ilvl w:val="0"/>
+          <w:numId w:val="1"/>
+        </w:numPr>
+        <w:rPr>
+          <w:lang w:val="de-CH"/>
+        </w:rPr>
+      </w:pPr>
+      <w:r>
+        <w:rPr>
+          <w:b/>
+          <w:bCs/>
+          <w:lang w:val="de-CH"/>
+        </w:rPr>
+        <w:t>APP NGƯỜI HÀN HỌC TIẾNG VIỆT</w:t>
+      </w:r>
+    </w:p>
+    <w:p>
+      <w:pPr>
+        <w:pStyle w:val="ListParagraph"/>
+      </w:pPr>
+      <w:hyperlink r:id="rId38" w:history="1">
+        <w:r>
+          <w:rPr>
+            <w:rStyle w:val="Hyperlink"/>
+            <w:lang w:val="de-CH"/>
+          </w:rPr>
+          <w:t>https://kr</w:t>
+        </w:r>
+        <w:r>
+          <w:rPr>
+            <w:rStyle w:val="Hyperlink"/>
+          </w:rPr>
+          <w:t>viet</w:t>
+        </w:r>
+        <w:r>
+          <w:rPr>
+            <w:rStyle w:val="Hyperlink"/>
+            <w:lang w:val="de-CH"/>
+          </w:rPr>
+          <w:t>.vercel.app/</w:t>
+        </w:r>
+      </w:hyperlink>
+    </w:p>
+    <w:p>
+      <w:pPr>
+        <w:pStyle w:val="ListParagraph"/>
+        <w:numPr>
+          <w:ilvl w:val="0"/>
+          <w:numId w:val="1"/>
+        </w:numPr>
+        <w:rPr>
+          <w:b/>
+          <w:bCs/>
+        </w:rPr>
+      </w:pPr>
+      <w:r>
+        <w:rPr>
+          <w:b/>
+          <w:bCs/>
+        </w:rPr>
+        <w:t xml:space="preserve">APP NGƯỜI </w:t>
+      </w:r>
+      <w:r>
+        <w:rPr>
+          <w:b/>
+          <w:bCs/>
+        </w:rPr>
+        <w:t xml:space="preserve">HOA </w:t>
+      </w:r>
+      <w:r>
+        <w:rPr>
+          <w:b/>
+          <w:bCs/>
+        </w:rPr>
+        <w:t>HỌC TIẾNG VIỆT</w:t>
+      </w:r>
+    </w:p>
+    <w:p>
+      <w:pPr>
+        <w:pStyle w:val="ListParagraph"/>
+        <w:rPr>
+          <w:lang w:val="de-CH"/>
+        </w:rPr>
+      </w:pPr>
+      <w:hyperlink r:id="rId39" w:history="1">
+        <w:r>
+          <w:rPr>
+            <w:rStyle w:val="Hyperlink"/>
+            <w:lang w:val="de-CH"/>
+          </w:rPr>
+          <w:t>https://</w:t>
+        </w:r>
+        <w:r>
+          <w:rPr>
+            <w:rStyle w:val="Hyperlink"/>
+          </w:rPr>
+          <w:t>zhviet</w:t>
+        </w:r>
+        <w:r>
+          <w:rPr>
+            <w:rStyle w:val="Hyperlink"/>
+            <w:lang w:val="de-CH"/>
+          </w:rPr>
+          <w:t>.vercel.app/</w:t>
+        </w:r>
+      </w:hyperlink>
+    </w:p>
+    <w:p>
+      <w:pPr>
+        <w:pStyle w:val="ListParagraph"/>
+        <w:rPr>
+          <w:lang w:val="de-CH"/>
+        </w:rPr>
+      </w:pPr>
+    </w:p>
+    <w:p>
+      <w:pPr>
+        <w:pStyle w:val="ListParagraph"/>
+        <w:rPr>
+          <w:lang w:val="de-CH"/>
+        </w:rPr>
+      </w:pPr>
+    </w:p>
+    <w:p>
+      <w:pPr>
+        <w:pStyle w:val="ListParagraph"/>
+        <w:numPr>
+          <w:ilvl w:val="0"/>
+          <w:numId w:val="1"/>
+        </w:numPr>
+        <w:rPr>
+          <w:b/>
+          <w:bCs/>
+          <w:lang w:val="de-CH"/>
+        </w:rPr>
+      </w:pPr>
+      <w:r>
+        <w:rPr>
+          <w:b/>
+          <w:bCs/>
+          <w:lang w:val="de-CH"/>
+        </w:rPr>
+        <w:lastRenderedPageBreak/>
+        <w:t>APP NGƯỜI</w:t>
+      </w:r>
+      <w:r>
+        <w:rPr>
+          <w:b/>
+          <w:bCs/>
+          <w:lang w:val="de-CH"/>
+        </w:rPr>
+        <w:t xml:space="preserve"> MỸ</w:t>
+      </w:r>
+      <w:r>
+        <w:rPr>
+          <w:b/>
+          <w:bCs/>
+          <w:lang w:val="de-CH"/>
+        </w:rPr>
+        <w:t xml:space="preserve"> HỌC TIẾNG VIỆT</w:t>
+      </w:r>
+    </w:p>
+    <w:p>
+      <w:pPr>
+        <w:pStyle w:val="ListParagraph"/>
+      </w:pPr>
+      <w:hyperlink r:id="rId40" w:history="1">
+        <w:r>
+          <w:rPr>
+            <w:rStyle w:val="Hyperlink"/>
+            <w:lang w:val="de-CH"/>
+          </w:rPr>
+          <w:t>https://</w:t>
+        </w:r>
+        <w:r>
+          <w:rPr>
+            <w:rStyle w:val="Hyperlink"/>
+          </w:rPr>
+          <w:t>usviet</w:t>
+        </w:r>
+        <w:r>
+          <w:rPr>
+            <w:rStyle w:val="Hyperlink"/>
+            <w:lang w:val="de-CH"/>
+          </w:rPr>
+          <w:t>.vercel.app/</w:t>
+        </w:r>
+      </w:hyperlink>
+    </w:p>
+    <w:p>
+      <w:pPr>
+        <w:pStyle w:val="ListParagraph"/>
+        <w:numPr>
+          <w:ilvl w:val="0"/>
+          <w:numId w:val="1"/>
+        </w:numPr>
+        <w:rPr>
+          <w:b/>
+          <w:bCs/>
+        </w:rPr>
+      </w:pPr>
+      <w:r>
+        <w:rPr>
+          <w:b/>
+          <w:bCs/>
+        </w:rPr>
+        <w:t xml:space="preserve">APP NGƯỜI </w:t>
+      </w:r>
+      <w:r>
+        <w:rPr>
+          <w:b/>
+          <w:bCs/>
+        </w:rPr>
+        <w:t>PHÁP</w:t>
+      </w:r>
+      <w:r>
+        <w:rPr>
+          <w:b/>
+          <w:bCs/>
+        </w:rPr>
+        <w:t xml:space="preserve"> HỌC TIẾNG VIỆT</w:t>
+      </w:r>
+    </w:p>
+    <w:p>
+      <w:pPr>
+        <w:pStyle w:val="ListParagraph"/>
+        <w:rPr>
+          <w:lang w:val="de-CH"/>
+        </w:rPr>
+      </w:pPr>
+      <w:hyperlink r:id="rId41" w:history="1">
+        <w:r>
+          <w:rPr>
+            <w:rStyle w:val="Hyperlink"/>
+            <w:lang w:val="de-CH"/>
+          </w:rPr>
+          <w:t>https://</w:t>
+        </w:r>
+        <w:r>
+          <w:rPr>
+            <w:rStyle w:val="Hyperlink"/>
+          </w:rPr>
+          <w:t>frviet</w:t>
+        </w:r>
+        <w:r>
+          <w:rPr>
+            <w:rStyle w:val="Hyperlink"/>
+            <w:lang w:val="de-CH"/>
+          </w:rPr>
+          <w:t>.vercel.app/</w:t>
+        </w:r>
+      </w:hyperlink>
+    </w:p>
+    <w:p>
+      <w:pPr>
+        <w:pStyle w:val="ListParagraph"/>
+        <w:numPr>
+          <w:ilvl w:val="0"/>
+          <w:numId w:val="1"/>
+        </w:numPr>
+        <w:rPr>
+          <w:b/>
+          <w:bCs/>
+          <w:lang w:val="de-CH"/>
+        </w:rPr>
+      </w:pPr>
+      <w:r>
+        <w:rPr>
+          <w:b/>
+          <w:bCs/>
+          <w:lang w:val="de-CH"/>
+        </w:rPr>
+        <w:t xml:space="preserve">APP NGƯỜI </w:t>
+      </w:r>
+      <w:r>
+        <w:rPr>
+          <w:b/>
+          <w:bCs/>
+          <w:lang w:val="de-CH"/>
+        </w:rPr>
+        <w:t>ĐỨC</w:t>
+      </w:r>
+      <w:r>
+        <w:rPr>
+          <w:b/>
+          <w:bCs/>
+          <w:lang w:val="de-CH"/>
+        </w:rPr>
+        <w:t xml:space="preserve"> HỌC TIẾNG VIỆT</w:t>
+      </w:r>
+    </w:p>
+    <w:p>
+      <w:pPr>
+        <w:pStyle w:val="ListParagraph"/>
+        <w:rPr>
+          <w:lang w:val="de-CH"/>
+        </w:rPr>
+      </w:pPr>
+      <w:hyperlink r:id="rId42" w:history="1">
+        <w:r>
+          <w:rPr>
+            <w:rStyle w:val="Hyperlink"/>
+            <w:lang w:val="de-CH"/>
+          </w:rPr>
+          <w:t>https://</w:t>
+        </w:r>
+        <w:r>
+          <w:rPr>
+            <w:rStyle w:val="Hyperlink"/>
+          </w:rPr>
+          <w:t>deviet</w:t>
+        </w:r>
+        <w:r>
+          <w:rPr>
+            <w:rStyle w:val="Hyperlink"/>
+            <w:lang w:val="de-CH"/>
+          </w:rPr>
+          <w:t>.vercel.app/</w:t>
+        </w:r>
+      </w:hyperlink>
+    </w:p>
+    <w:p>
+      <w:pPr>
+        <w:pStyle w:val="ListParagraph"/>
+        <w:numPr>
+          <w:ilvl w:val="0"/>
+          <w:numId w:val="1"/>
+        </w:numPr>
+        <w:rPr>
+          <w:b/>
+          <w:bCs/>
+          <w:lang w:val="de-CH"/>
+        </w:rPr>
+      </w:pPr>
+      <w:r>
+        <w:rPr>
+          <w:b/>
+          <w:bCs/>
+          <w:lang w:val="de-CH"/>
+        </w:rPr>
+        <w:t xml:space="preserve">APP NGƯỜI </w:t>
+      </w:r>
+      <w:r>
+        <w:rPr>
+          <w:b/>
+          <w:bCs/>
+          <w:lang w:val="de-CH"/>
+        </w:rPr>
+        <w:t>NGA</w:t>
+      </w:r>
+      <w:r>
+        <w:rPr>
+          <w:b/>
+          <w:bCs/>
+          <w:lang w:val="de-CH"/>
+        </w:rPr>
+        <w:t xml:space="preserve"> HỌC TIẾNG VIỆT</w:t>
+      </w:r>
+    </w:p>
+    <w:p>
+      <w:pPr>
+        <w:pStyle w:val="ListParagraph"/>
+        <w:rPr>
+          <w:lang w:val="de-CH"/>
+        </w:rPr>
+      </w:pPr>
+      <w:hyperlink r:id="rId43" w:history="1">
+        <w:r>
+          <w:rPr>
+            <w:rStyle w:val="Hyperlink"/>
+            <w:lang w:val="de-CH"/>
+          </w:rPr>
+          <w:t>https://</w:t>
+        </w:r>
+        <w:r>
+          <w:rPr>
+            <w:rStyle w:val="Hyperlink"/>
+          </w:rPr>
+          <w:t>ruviet</w:t>
+        </w:r>
+        <w:r>
+          <w:rPr>
+            <w:rStyle w:val="Hyperlink"/>
+            <w:lang w:val="de-CH"/>
+          </w:rPr>
+          <w:t>.vercel.app/</w:t>
+        </w:r>
+      </w:hyperlink>
+    </w:p>
+    <w:p>
+      <w:pPr>
+        <w:pStyle w:val="ListParagraph"/>
+        <w:numPr>
+          <w:ilvl w:val="0"/>
+          <w:numId w:val="1"/>
+        </w:numPr>
+        <w:rPr>
+          <w:b/>
+          <w:bCs/>
+          <w:lang w:val="de-CH"/>
+        </w:rPr>
+      </w:pPr>
+      <w:r>
+        <w:rPr>
+          <w:b/>
+          <w:bCs/>
+          <w:lang w:val="de-CH"/>
+        </w:rPr>
+        <w:t>APP</w:t>
+      </w:r>
+      <w:r>
+        <w:rPr>
+          <w:b/>
+          <w:bCs/>
+          <w:lang w:val="de-CH"/>
+        </w:rPr>
+        <w:t xml:space="preserve"> NGƯỜI</w:t>
+      </w:r>
+      <w:r>
+        <w:rPr>
+          <w:b/>
+          <w:bCs/>
+          <w:lang w:val="de-CH"/>
         </w:rPr>
         <w:t xml:space="preserve"> </w:t>
       </w:r>
-      <w:proofErr w:type="spellStart"/>
-      <w:r>
-        <w:rPr>
-          <w:b/>
-          <w:bCs/>
-        </w:rPr>
-        <w:t>Quyết</w:t>
-      </w:r>
-      <w:proofErr w:type="spellEnd"/>
-      <w:r>
-        <w:rPr>
-          <w:b/>
-          <w:bCs/>
-        </w:rPr>
-        <w:t xml:space="preserve"> </w:t>
-      </w:r>
-      <w:proofErr w:type="spellStart"/>
-      <w:r>
-        <w:rPr>
-          <w:b/>
-          <w:bCs/>
-        </w:rPr>
-        <w:t>định</w:t>
-      </w:r>
-      <w:proofErr w:type="spellEnd"/>
-      <w:r>
-        <w:rPr>
-          <w:b/>
-          <w:bCs/>
-        </w:rPr>
-        <w:t xml:space="preserve"> 2429/QĐ-BYT1731.</w:t>
-      </w:r>
-    </w:p>
-    <w:p>
-      <w:pPr>
-        <w:pStyle w:val="ListParagraph"/>
-      </w:pPr>
-      <w:hyperlink r:id="rId33" w:history="1">
-        <w:r>
-          <w:rPr>
-            <w:rStyle w:val="Hyperlink"/>
+      <w:r>
+        <w:rPr>
+          <w:b/>
+          <w:bCs/>
+          <w:lang w:val="de-CH"/>
+        </w:rPr>
+        <w:t>CAMBODIA</w:t>
+      </w:r>
+      <w:r>
+        <w:rPr>
+          <w:b/>
+          <w:bCs/>
+          <w:lang w:val="de-CH"/>
+        </w:rPr>
+        <w:t xml:space="preserve"> HỌC TIẾNG VIỆT</w:t>
+      </w:r>
+    </w:p>
+    <w:p>
+      <w:pPr>
+        <w:pStyle w:val="ListParagraph"/>
+        <w:rPr>
+          <w:lang w:val="de-CH"/>
+        </w:rPr>
+      </w:pPr>
+      <w:hyperlink r:id="rId44" w:history="1">
+        <w:r>
+          <w:rPr>
+            <w:rStyle w:val="Hyperlink"/>
+            <w:lang w:val="de-CH"/>
           </w:rPr>
           <w:t>https://</w:t>
         </w:r>
@@ -1145,107 +1780,67 @@
           <w:rPr>
             <w:rStyle w:val="Hyperlink"/>
           </w:rPr>
-          <w:t>tropilab.vercel.app</w:t>
-        </w:r>
-      </w:hyperlink>
-    </w:p>
-    <w:p>
-      <w:pPr>
-        <w:pStyle w:val="ListParagraph"/>
-        <w:numPr>
-          <w:ilvl w:val="0"/>
-          <w:numId w:val="1"/>
-        </w:numPr>
-        <w:rPr>
-          <w:b/>
-          <w:bCs/>
-        </w:rPr>
-      </w:pPr>
-      <w:r>
-        <w:rPr>
-          <w:b/>
-          <w:bCs/>
-        </w:rPr>
-        <w:t xml:space="preserve">WEB LANDING PAGE </w:t>
-      </w:r>
-      <w:r>
-        <w:rPr>
-          <w:b/>
-          <w:bCs/>
-        </w:rPr>
-        <w:t>QUẢNG CÁO ỨNG DỤN</w:t>
-      </w:r>
-      <w:r>
-        <w:rPr>
-          <w:b/>
-          <w:bCs/>
-        </w:rPr>
-        <w:t>G LÀM CHA MẸ</w:t>
-      </w:r>
-    </w:p>
-    <w:p>
-      <w:pPr>
-        <w:pStyle w:val="ListParagraph"/>
-        <w:rPr>
-          <w:lang w:val="de-CH"/>
-        </w:rPr>
-      </w:pPr>
-      <w:hyperlink r:id="rId34" w:history="1">
+          <w:t>khviet</w:t>
+        </w:r>
         <w:r>
           <w:rPr>
             <w:rStyle w:val="Hyperlink"/>
             <w:lang w:val="de-CH"/>
           </w:rPr>
-          <w:t>https://lamchame.vercel.app/</w:t>
-        </w:r>
-      </w:hyperlink>
-    </w:p>
-    <w:p>
-      <w:pPr>
-        <w:pStyle w:val="ListParagraph"/>
-        <w:numPr>
-          <w:ilvl w:val="0"/>
-          <w:numId w:val="1"/>
-        </w:numPr>
-        <w:rPr>
-          <w:b/>
-          <w:bCs/>
-          <w:lang w:val="de-CH"/>
-        </w:rPr>
-      </w:pPr>
-      <w:r>
-        <w:rPr>
-          <w:b/>
-          <w:bCs/>
-          <w:lang w:val="de-CH"/>
-        </w:rPr>
-        <w:t>APP DAY T</w:t>
-      </w:r>
-      <w:r>
-        <w:rPr>
-          <w:b/>
-          <w:bCs/>
-          <w:lang w:val="de-CH"/>
-        </w:rPr>
-        <w:t>IẾNG VIỆT CHO NGƯỜI NƯỚC N</w:t>
-      </w:r>
-      <w:r>
-        <w:rPr>
-          <w:b/>
-          <w:bCs/>
-          <w:lang w:val="de-CH"/>
-        </w:rPr>
-        <w:t>GOÀI</w:t>
-      </w:r>
-    </w:p>
-    <w:p>
-      <w:pPr>
-        <w:pStyle w:val="ListParagraph"/>
-      </w:pPr>
-      <w:hyperlink r:id="rId35" w:history="1">
-        <w:r>
-          <w:rPr>
-            <w:rStyle w:val="Hyperlink"/>
+          <w:t>.vercel.app/</w:t>
+        </w:r>
+      </w:hyperlink>
+    </w:p>
+    <w:p>
+      <w:pPr>
+        <w:pStyle w:val="ListParagraph"/>
+        <w:numPr>
+          <w:ilvl w:val="0"/>
+          <w:numId w:val="1"/>
+        </w:numPr>
+        <w:rPr>
+          <w:b/>
+          <w:bCs/>
+          <w:lang w:val="de-CH"/>
+        </w:rPr>
+      </w:pPr>
+      <w:r>
+        <w:rPr>
+          <w:b/>
+          <w:bCs/>
+          <w:lang w:val="de-CH"/>
+        </w:rPr>
+        <w:t xml:space="preserve">APP </w:t>
+      </w:r>
+      <w:r>
+        <w:rPr>
+          <w:b/>
+          <w:bCs/>
+          <w:lang w:val="de-CH"/>
+        </w:rPr>
+        <w:t xml:space="preserve">LÀO </w:t>
+      </w:r>
+      <w:r>
+        <w:rPr>
+          <w:b/>
+          <w:bCs/>
+          <w:lang w:val="de-CH"/>
+        </w:rPr>
+        <w:t>HỌC TIẾNG VIỆT</w:t>
+      </w:r>
+    </w:p>
+    <w:p>
+      <w:pPr>
+        <w:pStyle w:val="ListParagraph"/>
+        <w:rPr>
+          <w:lang w:val="de-CH"/>
+        </w:rPr>
+      </w:pPr>
+      <w:hyperlink r:id="rId45" w:history="1">
+        <w:r>
+          <w:rPr>
+            <w:rStyle w:val="Hyperlink"/>
+            <w:lang w:val="de-CH"/>
           </w:rPr>
           <w:t>https://</w:t>
         </w:r>
@@ -1253,11 +1848,12 @@
           <w:rPr>
             <w:rStyle w:val="Hyperlink"/>
           </w:rPr>
-          <w:t>vietreal</w:t>
-        </w:r>
-        <w:r>
-          <w:rPr>
-            <w:rStyle w:val="Hyperlink"/>
+          <w:t>laviet</w:t>
+        </w:r>
+        <w:r>
+          <w:rPr>
+            <w:rStyle w:val="Hyperlink"/>
+            <w:lang w:val="de-CH"/>
           </w:rPr>
           <w:t>.vercel.app/</w:t>
         </w:r>
@@ -1273,12 +1869,14 @@
         <w:rPr>
           <w:b/>
           <w:bCs/>
-        </w:rPr>
-      </w:pPr>
-      <w:r>
-        <w:rPr>
-          <w:b/>
-          <w:bCs/>
+          <w:lang w:val="de-CH"/>
+        </w:rPr>
+      </w:pPr>
+      <w:r>
+        <w:rPr>
+          <w:b/>
+          <w:bCs/>
+          <w:lang w:val="de-CH"/>
         </w:rPr>
         <w:t xml:space="preserve">APP </w:t>
       </w:r>
@@ -1286,25 +1884,27 @@
         <w:rPr>
           <w:b/>
           <w:bCs/>
-        </w:rPr>
-        <w:t>NGƯỜI NHẬT HỌC T</w:t>
-      </w:r>
-      <w:r>
-        <w:rPr>
-          <w:b/>
-          <w:bCs/>
-        </w:rPr>
-        <w:t>IẾNG VIỆT</w:t>
-      </w:r>
-    </w:p>
-    <w:p>
-      <w:pPr>
-        <w:pStyle w:val="ListParagraph"/>
-        <w:rPr>
-          <w:lang w:val="de-CH"/>
-        </w:rPr>
-      </w:pPr>
-      <w:hyperlink r:id="rId36" w:history="1">
+          <w:lang w:val="de-CH"/>
+        </w:rPr>
+        <w:t xml:space="preserve">ẤN </w:t>
+      </w:r>
+      <w:r>
+        <w:rPr>
+          <w:b/>
+          <w:bCs/>
+          <w:lang w:val="de-CH"/>
+        </w:rPr>
+        <w:t>HỌC TIẾNG VIỆT</w:t>
+      </w:r>
+    </w:p>
+    <w:p>
+      <w:pPr>
+        <w:pStyle w:val="ListParagraph"/>
+        <w:rPr>
+          <w:lang w:val="de-CH"/>
+        </w:rPr>
+      </w:pPr>
+      <w:hyperlink r:id="rId46" w:history="1">
         <w:r>
           <w:rPr>
             <w:rStyle w:val="Hyperlink"/>
@@ -1316,7 +1916,7 @@
           <w:rPr>
             <w:rStyle w:val="Hyperlink"/>
           </w:rPr>
-          <w:t>betonavi</w:t>
+          <w:t>inviet</w:t>
         </w:r>
         <w:r>
           <w:rPr>
@@ -1329,7 +1929,333 @@
     </w:p>
     <w:p>
       <w:pPr>
-        <w:ind w:left="720" w:firstLine="720"/>
+        <w:pStyle w:val="ListParagraph"/>
+        <w:numPr>
+          <w:ilvl w:val="0"/>
+          <w:numId w:val="1"/>
+        </w:numPr>
+        <w:rPr>
+          <w:b/>
+          <w:bCs/>
+          <w:lang w:val="de-CH"/>
+        </w:rPr>
+      </w:pPr>
+      <w:r>
+        <w:rPr>
+          <w:b/>
+          <w:bCs/>
+          <w:lang w:val="de-CH"/>
+        </w:rPr>
+        <w:t xml:space="preserve">APP </w:t>
+      </w:r>
+      <w:r>
+        <w:rPr>
+          <w:b/>
+          <w:bCs/>
+          <w:lang w:val="de-CH"/>
+        </w:rPr>
+        <w:t xml:space="preserve">TÂY BAN NHA </w:t>
+      </w:r>
+      <w:r>
+        <w:rPr>
+          <w:b/>
+          <w:bCs/>
+          <w:lang w:val="de-CH"/>
+        </w:rPr>
+        <w:t>HỌC TIẾNG VIỆT</w:t>
+      </w:r>
+    </w:p>
+    <w:p>
+      <w:pPr>
+        <w:pStyle w:val="ListParagraph"/>
+        <w:rPr>
+          <w:lang w:val="de-CH"/>
+        </w:rPr>
+      </w:pPr>
+      <w:hyperlink r:id="rId47" w:history="1">
+        <w:r>
+          <w:rPr>
+            <w:rStyle w:val="Hyperlink"/>
+            <w:lang w:val="de-CH"/>
+          </w:rPr>
+          <w:t>https://</w:t>
+        </w:r>
+        <w:r>
+          <w:rPr>
+            <w:rStyle w:val="Hyperlink"/>
+          </w:rPr>
+          <w:t>esviet</w:t>
+        </w:r>
+        <w:r>
+          <w:rPr>
+            <w:rStyle w:val="Hyperlink"/>
+            <w:lang w:val="de-CH"/>
+          </w:rPr>
+          <w:t>.vercel.app/</w:t>
+        </w:r>
+      </w:hyperlink>
+    </w:p>
+    <w:p>
+      <w:pPr>
+        <w:pStyle w:val="ListParagraph"/>
+        <w:numPr>
+          <w:ilvl w:val="0"/>
+          <w:numId w:val="1"/>
+        </w:numPr>
+        <w:rPr>
+          <w:b/>
+          <w:bCs/>
+          <w:lang w:val="de-CH"/>
+        </w:rPr>
+      </w:pPr>
+      <w:r>
+        <w:rPr>
+          <w:b/>
+          <w:bCs/>
+          <w:lang w:val="de-CH"/>
+        </w:rPr>
+        <w:t xml:space="preserve">APP </w:t>
+      </w:r>
+      <w:r>
+        <w:rPr>
+          <w:b/>
+          <w:bCs/>
+          <w:lang w:val="de-CH"/>
+        </w:rPr>
+        <w:t xml:space="preserve">BỒ ĐÀO NHA </w:t>
+      </w:r>
+      <w:r>
+        <w:rPr>
+          <w:b/>
+          <w:bCs/>
+          <w:lang w:val="de-CH"/>
+        </w:rPr>
+        <w:t>HỌC TIẾNG VIỆT</w:t>
+      </w:r>
+    </w:p>
+    <w:p>
+      <w:pPr>
+        <w:pStyle w:val="ListParagraph"/>
+        <w:rPr>
+          <w:lang w:val="de-CH"/>
+        </w:rPr>
+      </w:pPr>
+      <w:hyperlink r:id="rId48" w:history="1">
+        <w:r>
+          <w:rPr>
+            <w:rStyle w:val="Hyperlink"/>
+            <w:lang w:val="de-CH"/>
+          </w:rPr>
+          <w:t>https://ptviet.vercel.app/</w:t>
+        </w:r>
+      </w:hyperlink>
+    </w:p>
+    <w:p>
+      <w:pPr>
+        <w:pStyle w:val="ListParagraph"/>
+        <w:numPr>
+          <w:ilvl w:val="0"/>
+          <w:numId w:val="1"/>
+        </w:numPr>
+        <w:rPr>
+          <w:b/>
+          <w:bCs/>
+          <w:lang w:val="de-CH"/>
+        </w:rPr>
+      </w:pPr>
+      <w:r>
+        <w:rPr>
+          <w:b/>
+          <w:bCs/>
+          <w:lang w:val="de-CH"/>
+        </w:rPr>
+        <w:t>WEB HƯỚNG DẪN BẢO QUẢN BÚN TƯƠI</w:t>
+      </w:r>
+    </w:p>
+    <w:p>
+      <w:pPr>
+        <w:pStyle w:val="ListParagraph"/>
+        <w:rPr>
+          <w:lang w:val="de-CH"/>
+        </w:rPr>
+      </w:pPr>
+      <w:hyperlink r:id="rId49" w:history="1">
+        <w:r>
+          <w:rPr>
+            <w:rStyle w:val="Hyperlink"/>
+            <w:lang w:val="de-CH"/>
+          </w:rPr>
+          <w:t>https://baoquanbun.vercel.app</w:t>
+        </w:r>
+      </w:hyperlink>
+    </w:p>
+    <w:p>
+      <w:pPr>
+        <w:pStyle w:val="ListParagraph"/>
+        <w:numPr>
+          <w:ilvl w:val="0"/>
+          <w:numId w:val="1"/>
+        </w:numPr>
+        <w:rPr>
+          <w:b/>
+          <w:bCs/>
+          <w:lang w:val="de-CH"/>
+        </w:rPr>
+      </w:pPr>
+      <w:r>
+        <w:rPr>
+          <w:b/>
+          <w:bCs/>
+          <w:lang w:val="de-CH"/>
+        </w:rPr>
+        <w:t>APP TRỢ LÝ GIÁM ĐỐC NGÂN HÀNG</w:t>
+      </w:r>
+    </w:p>
+    <w:p>
+      <w:pPr>
+        <w:pStyle w:val="ListParagraph"/>
+      </w:pPr>
+      <w:hyperlink r:id="rId50" w:history="1">
+        <w:r>
+          <w:rPr>
+            <w:rStyle w:val="Hyperlink"/>
+            <w:lang w:val="de-CH"/>
+          </w:rPr>
+          <w:t>https://trolybank.vercel.app</w:t>
+        </w:r>
+      </w:hyperlink>
+    </w:p>
+    <w:p>
+      <w:pPr>
+        <w:pStyle w:val="ListParagraph"/>
+        <w:numPr>
+          <w:ilvl w:val="0"/>
+          <w:numId w:val="1"/>
+        </w:numPr>
+        <w:rPr>
+          <w:b/>
+          <w:bCs/>
+        </w:rPr>
+      </w:pPr>
+      <w:r>
+        <w:rPr>
+          <w:b/>
+          <w:bCs/>
+        </w:rPr>
+        <w:t>WEB TẠO YÊU CẦU THIÊT KẾ</w:t>
+      </w:r>
+    </w:p>
+    <w:p>
+      <w:pPr>
+        <w:pStyle w:val="ListParagraph"/>
+        <w:rPr>
+          <w:lang w:val="de-CH"/>
+        </w:rPr>
+      </w:pPr>
+      <w:hyperlink r:id="rId51" w:history="1">
+        <w:r>
+          <w:rPr>
+            <w:rStyle w:val="Hyperlink"/>
+            <w:lang w:val="de-CH"/>
+          </w:rPr>
+          <w:t>https://yeucau.vercel.app/</w:t>
+        </w:r>
+      </w:hyperlink>
+    </w:p>
+    <w:p>
+      <w:pPr>
+        <w:pStyle w:val="ListParagraph"/>
+        <w:numPr>
+          <w:ilvl w:val="0"/>
+          <w:numId w:val="1"/>
+        </w:numPr>
+        <w:rPr>
+          <w:b/>
+          <w:bCs/>
+          <w:lang w:val="de-CH"/>
+        </w:rPr>
+      </w:pPr>
+      <w:r>
+        <w:rPr>
+          <w:b/>
+          <w:bCs/>
+          <w:lang w:val="de-CH"/>
+        </w:rPr>
+        <w:t>WEB HỆ SINH THÁI HỌC TIẾNG VIỆT</w:t>
+      </w:r>
+    </w:p>
+    <w:p>
+      <w:pPr>
+        <w:pStyle w:val="ListParagraph"/>
+        <w:ind w:left="1211"/>
+        <w:rPr>
+          <w:lang w:val="de-CH"/>
+        </w:rPr>
+      </w:pPr>
+      <w:hyperlink r:id="rId52" w:history="1">
+        <w:r>
+          <w:rPr>
+            <w:rStyle w:val="Hyperlink"/>
+            <w:lang w:val="de-CH"/>
+          </w:rPr>
+          <w:t>https://vietnavi.vercel.app/</w:t>
+        </w:r>
+      </w:hyperlink>
+    </w:p>
+    <w:p>
+      <w:pPr>
+        <w:pStyle w:val="ListParagraph"/>
+        <w:numPr>
+          <w:ilvl w:val="0"/>
+          <w:numId w:val="1"/>
+        </w:numPr>
+        <w:rPr>
+          <w:b/>
+          <w:bCs/>
+          <w:lang w:val="de-CH"/>
+        </w:rPr>
+      </w:pPr>
+      <w:r>
+        <w:rPr>
+          <w:b/>
+          <w:bCs/>
+          <w:lang w:val="de-CH"/>
+        </w:rPr>
+        <w:t>ỨNG DỤNG ĂN GÌ CHO KHỎE DÀNH CHO NGƯỜI VIỆT</w:t>
+      </w:r>
+    </w:p>
+    <w:p>
+      <w:pPr>
+        <w:pStyle w:val="ListParagraph"/>
+        <w:ind w:left="1211"/>
+        <w:rPr>
+          <w:lang w:val="de-CH"/>
+        </w:rPr>
+      </w:pPr>
+      <w:hyperlink r:id="rId53" w:history="1">
+        <w:r>
+          <w:rPr>
+            <w:rStyle w:val="Hyperlink"/>
+            <w:lang w:val="de-CH"/>
+          </w:rPr>
+          <w:t>https://vietnuti.vercel.app/</w:t>
+        </w:r>
+      </w:hyperlink>
+    </w:p>
+    <w:p>
+      <w:pPr>
+        <w:pStyle w:val="ListParagraph"/>
+        <w:ind w:left="1211"/>
+        <w:rPr>
+          <w:lang w:val="de-CH"/>
+        </w:rPr>
+      </w:pPr>
+    </w:p>
+    <w:p>
+      <w:pPr>
+        <w:rPr>
+          <w:lang w:val="de-CH"/>
+        </w:rPr>
       </w:pPr>
     </w:p>
     <w:sectPr>
@@ -1354,7 +2280,7 @@
       <w:lvlText w:val="%1."/>
       <w:lvlJc w:val="left"/>
       <w:pPr>
-        <w:ind w:left="720" w:hanging="360"/>
+        <w:ind w:left="1211" w:hanging="360"/>
       </w:pPr>
       <w:rPr>
         <w:rFonts w:hint="default"/>
@@ -1434,6 +2360,95 @@
     </w:lvl>
   </w:abstractNum>
   <w:abstractNum w:abstractNumId="1" w15:restartNumberingAfterBreak="0">
+    <w:nsid w:val="2E344F57"/>
+    <w:multiLevelType w:val="hybridMultilevel"/>
+    <w:tmpl w:val="AF6E8432"/>
+    <w:lvl w:ilvl="0" w:tplc="FFFFFFFF">
+      <w:start w:val="1"/>
+      <w:numFmt w:val="decimal"/>
+      <w:lvlText w:val="%1."/>
+      <w:lvlJc w:val="left"/>
+      <w:pPr>
+        <w:ind w:left="1211" w:hanging="360"/>
+      </w:pPr>
+      <w:rPr>
+        <w:rFonts w:hint="default"/>
+      </w:rPr>
+    </w:lvl>
+    <w:lvl w:ilvl="1" w:tplc="FFFFFFFF" w:tentative="1">
+      <w:start w:val="1"/>
+      <w:numFmt w:val="lowerLetter"/>
+      <w:lvlText w:val="%2."/>
+      <w:lvlJc w:val="left"/>
+      <w:pPr>
+        <w:ind w:left="1440" w:hanging="360"/>
+      </w:pPr>
+    </w:lvl>
+    <w:lvl w:ilvl="2" w:tplc="FFFFFFFF" w:tentative="1">
+      <w:start w:val="1"/>
+      <w:numFmt w:val="lowerRoman"/>
+      <w:lvlText w:val="%3."/>
+      <w:lvlJc w:val="right"/>
+      <w:pPr>
+        <w:ind w:left="2160" w:hanging="180"/>
+      </w:pPr>
+    </w:lvl>
+    <w:lvl w:ilvl="3" w:tplc="FFFFFFFF" w:tentative="1">
+      <w:start w:val="1"/>
+      <w:numFmt w:val="decimal"/>
+      <w:lvlText w:val="%4."/>
+      <w:lvlJc w:val="left"/>
+      <w:pPr>
+        <w:ind w:left="2880" w:hanging="360"/>
+      </w:pPr>
+    </w:lvl>
+    <w:lvl w:ilvl="4" w:tplc="FFFFFFFF" w:tentative="1">
+      <w:start w:val="1"/>
+      <w:numFmt w:val="lowerLetter"/>
+      <w:lvlText w:val="%5."/>
+      <w:lvlJc w:val="left"/>
+      <w:pPr>
+        <w:ind w:left="3600" w:hanging="360"/>
+      </w:pPr>
+    </w:lvl>
+    <w:lvl w:ilvl="5" w:tplc="FFFFFFFF" w:tentative="1">
+      <w:start w:val="1"/>
+      <w:numFmt w:val="lowerRoman"/>
+      <w:lvlText w:val="%6."/>
+      <w:lvlJc w:val="right"/>
+      <w:pPr>
+        <w:ind w:left="4320" w:hanging="180"/>
+      </w:pPr>
+    </w:lvl>
+    <w:lvl w:ilvl="6" w:tplc="FFFFFFFF" w:tentative="1">
+      <w:start w:val="1"/>
+      <w:numFmt w:val="decimal"/>
+      <w:lvlText w:val="%7."/>
+      <w:lvlJc w:val="left"/>
+      <w:pPr>
+        <w:ind w:left="5040" w:hanging="360"/>
+      </w:pPr>
+    </w:lvl>
+    <w:lvl w:ilvl="7" w:tplc="FFFFFFFF" w:tentative="1">
+      <w:start w:val="1"/>
+      <w:numFmt w:val="lowerLetter"/>
+      <w:lvlText w:val="%8."/>
+      <w:lvlJc w:val="left"/>
+      <w:pPr>
+        <w:ind w:left="5760" w:hanging="360"/>
+      </w:pPr>
+    </w:lvl>
+    <w:lvl w:ilvl="8" w:tplc="FFFFFFFF" w:tentative="1">
+      <w:start w:val="1"/>
+      <w:numFmt w:val="lowerRoman"/>
+      <w:lvlText w:val="%9."/>
+      <w:lvlJc w:val="right"/>
+      <w:pPr>
+        <w:ind w:left="6480" w:hanging="180"/>
+      </w:pPr>
+    </w:lvl>
+  </w:abstractNum>
+  <w:abstractNum w:abstractNumId="2" w15:restartNumberingAfterBreak="0">
     <w:nsid w:val="39AF386A"/>
     <w:multiLevelType w:val="multilevel"/>
     <w:tmpl w:val="139A3DBE"/>
@@ -1580,12 +2595,199 @@
         <w:rFonts w:ascii="Wingdings" w:hAnsi="Wingdings" w:hint="default"/>
         <w:sz w:val="20"/>
       </w:rPr>
+    </w:lvl>
+  </w:abstractNum>
+  <w:abstractNum w:abstractNumId="3" w15:restartNumberingAfterBreak="0">
+    <w:nsid w:val="3CC516FF"/>
+    <w:multiLevelType w:val="hybridMultilevel"/>
+    <w:tmpl w:val="AF6E8432"/>
+    <w:lvl w:ilvl="0" w:tplc="FFFFFFFF">
+      <w:start w:val="1"/>
+      <w:numFmt w:val="decimal"/>
+      <w:lvlText w:val="%1."/>
+      <w:lvlJc w:val="left"/>
+      <w:pPr>
+        <w:ind w:left="1211" w:hanging="360"/>
+      </w:pPr>
+      <w:rPr>
+        <w:rFonts w:hint="default"/>
+      </w:rPr>
+    </w:lvl>
+    <w:lvl w:ilvl="1" w:tplc="FFFFFFFF" w:tentative="1">
+      <w:start w:val="1"/>
+      <w:numFmt w:val="lowerLetter"/>
+      <w:lvlText w:val="%2."/>
+      <w:lvlJc w:val="left"/>
+      <w:pPr>
+        <w:ind w:left="1440" w:hanging="360"/>
+      </w:pPr>
+    </w:lvl>
+    <w:lvl w:ilvl="2" w:tplc="FFFFFFFF" w:tentative="1">
+      <w:start w:val="1"/>
+      <w:numFmt w:val="lowerRoman"/>
+      <w:lvlText w:val="%3."/>
+      <w:lvlJc w:val="right"/>
+      <w:pPr>
+        <w:ind w:left="2160" w:hanging="180"/>
+      </w:pPr>
+    </w:lvl>
+    <w:lvl w:ilvl="3" w:tplc="FFFFFFFF" w:tentative="1">
+      <w:start w:val="1"/>
+      <w:numFmt w:val="decimal"/>
+      <w:lvlText w:val="%4."/>
+      <w:lvlJc w:val="left"/>
+      <w:pPr>
+        <w:ind w:left="2880" w:hanging="360"/>
+      </w:pPr>
+    </w:lvl>
+    <w:lvl w:ilvl="4" w:tplc="FFFFFFFF" w:tentative="1">
+      <w:start w:val="1"/>
+      <w:numFmt w:val="lowerLetter"/>
+      <w:lvlText w:val="%5."/>
+      <w:lvlJc w:val="left"/>
+      <w:pPr>
+        <w:ind w:left="3600" w:hanging="360"/>
+      </w:pPr>
+    </w:lvl>
+    <w:lvl w:ilvl="5" w:tplc="FFFFFFFF" w:tentative="1">
+      <w:start w:val="1"/>
+      <w:numFmt w:val="lowerRoman"/>
+      <w:lvlText w:val="%6."/>
+      <w:lvlJc w:val="right"/>
+      <w:pPr>
+        <w:ind w:left="4320" w:hanging="180"/>
+      </w:pPr>
+    </w:lvl>
+    <w:lvl w:ilvl="6" w:tplc="FFFFFFFF" w:tentative="1">
+      <w:start w:val="1"/>
+      <w:numFmt w:val="decimal"/>
+      <w:lvlText w:val="%7."/>
+      <w:lvlJc w:val="left"/>
+      <w:pPr>
+        <w:ind w:left="5040" w:hanging="360"/>
+      </w:pPr>
+    </w:lvl>
+    <w:lvl w:ilvl="7" w:tplc="FFFFFFFF" w:tentative="1">
+      <w:start w:val="1"/>
+      <w:numFmt w:val="lowerLetter"/>
+      <w:lvlText w:val="%8."/>
+      <w:lvlJc w:val="left"/>
+      <w:pPr>
+        <w:ind w:left="5760" w:hanging="360"/>
+      </w:pPr>
+    </w:lvl>
+    <w:lvl w:ilvl="8" w:tplc="FFFFFFFF" w:tentative="1">
+      <w:start w:val="1"/>
+      <w:numFmt w:val="lowerRoman"/>
+      <w:lvlText w:val="%9."/>
+      <w:lvlJc w:val="right"/>
+      <w:pPr>
+        <w:ind w:left="6480" w:hanging="180"/>
+      </w:pPr>
+    </w:lvl>
+  </w:abstractNum>
+  <w:abstractNum w:abstractNumId="4" w15:restartNumberingAfterBreak="0">
+    <w:nsid w:val="5844602D"/>
+    <w:multiLevelType w:val="hybridMultilevel"/>
+    <w:tmpl w:val="AF6E8432"/>
+    <w:lvl w:ilvl="0" w:tplc="FFFFFFFF">
+      <w:start w:val="1"/>
+      <w:numFmt w:val="decimal"/>
+      <w:lvlText w:val="%1."/>
+      <w:lvlJc w:val="left"/>
+      <w:pPr>
+        <w:ind w:left="1211" w:hanging="360"/>
+      </w:pPr>
+      <w:rPr>
+        <w:rFonts w:hint="default"/>
+      </w:rPr>
+    </w:lvl>
+    <w:lvl w:ilvl="1" w:tplc="FFFFFFFF" w:tentative="1">
+      <w:start w:val="1"/>
+      <w:numFmt w:val="lowerLetter"/>
+      <w:lvlText w:val="%2."/>
+      <w:lvlJc w:val="left"/>
+      <w:pPr>
+        <w:ind w:left="1440" w:hanging="360"/>
+      </w:pPr>
+    </w:lvl>
+    <w:lvl w:ilvl="2" w:tplc="FFFFFFFF" w:tentative="1">
+      <w:start w:val="1"/>
+      <w:numFmt w:val="lowerRoman"/>
+      <w:lvlText w:val="%3."/>
+      <w:lvlJc w:val="right"/>
+      <w:pPr>
+        <w:ind w:left="2160" w:hanging="180"/>
+      </w:pPr>
+    </w:lvl>
+    <w:lvl w:ilvl="3" w:tplc="FFFFFFFF" w:tentative="1">
+      <w:start w:val="1"/>
+      <w:numFmt w:val="decimal"/>
+      <w:lvlText w:val="%4."/>
+      <w:lvlJc w:val="left"/>
+      <w:pPr>
+        <w:ind w:left="2880" w:hanging="360"/>
+      </w:pPr>
+    </w:lvl>
+    <w:lvl w:ilvl="4" w:tplc="FFFFFFFF" w:tentative="1">
+      <w:start w:val="1"/>
+      <w:numFmt w:val="lowerLetter"/>
+      <w:lvlText w:val="%5."/>
+      <w:lvlJc w:val="left"/>
+      <w:pPr>
+        <w:ind w:left="3600" w:hanging="360"/>
+      </w:pPr>
+    </w:lvl>
+    <w:lvl w:ilvl="5" w:tplc="FFFFFFFF" w:tentative="1">
+      <w:start w:val="1"/>
+      <w:numFmt w:val="lowerRoman"/>
+      <w:lvlText w:val="%6."/>
+      <w:lvlJc w:val="right"/>
+      <w:pPr>
+        <w:ind w:left="4320" w:hanging="180"/>
+      </w:pPr>
+    </w:lvl>
+    <w:lvl w:ilvl="6" w:tplc="FFFFFFFF" w:tentative="1">
+      <w:start w:val="1"/>
+      <w:numFmt w:val="decimal"/>
+      <w:lvlText w:val="%7."/>
+      <w:lvlJc w:val="left"/>
+      <w:pPr>
+        <w:ind w:left="5040" w:hanging="360"/>
+      </w:pPr>
+    </w:lvl>
+    <w:lvl w:ilvl="7" w:tplc="FFFFFFFF" w:tentative="1">
+      <w:start w:val="1"/>
+      <w:numFmt w:val="lowerLetter"/>
+      <w:lvlText w:val="%8."/>
+      <w:lvlJc w:val="left"/>
+      <w:pPr>
+        <w:ind w:left="5760" w:hanging="360"/>
+      </w:pPr>
+    </w:lvl>
+    <w:lvl w:ilvl="8" w:tplc="FFFFFFFF" w:tentative="1">
+      <w:start w:val="1"/>
+      <w:numFmt w:val="lowerRoman"/>
+      <w:lvlText w:val="%9."/>
+      <w:lvlJc w:val="right"/>
+      <w:pPr>
+        <w:ind w:left="6480" w:hanging="180"/>
+      </w:pPr>
     </w:lvl>
   </w:abstractNum>
   <w:num w:numId="1" w16cid:durableId="2009363746">
     <w:abstractNumId w:val="0"/>
   </w:num>
   <w:num w:numId="2" w16cid:durableId="222722018">
+    <w:abstractNumId w:val="2"/>
+  </w:num>
+  <w:num w:numId="3" w16cid:durableId="1505169164">
+    <w:abstractNumId w:val="4"/>
+  </w:num>
+  <w:num w:numId="4" w16cid:durableId="1680964081">
+    <w:abstractNumId w:val="3"/>
+  </w:num>
+  <w:num w:numId="5" w16cid:durableId="2089038939">
     <w:abstractNumId w:val="1"/>
   </w:num>
 </w:numbering>

</xml_diff>

<commit_message>
feat: them ung dung moi VietNail Guide AI (https://vietnail.vercel.app) len trang dau ungdung.vercel.app
</commit_message>
<xml_diff>
--- a/260826-DANH SACH CÁC APP WEB DA THUC HIEN.docx
+++ b/260826-DANH SACH CÁC APP WEB DA THUC HIEN.docx
@@ -21,8 +21,9 @@
           <w:sz w:val="38"/>
           <w:szCs w:val="38"/>
         </w:rPr>
-        <w:t xml:space="preserve">DANH SÁCH  </w:t>
-      </w:r>
+        <w:t xml:space="preserve">DANH </w:t>
+      </w:r>
+      <w:proofErr w:type="gramStart"/>
       <w:r>
         <w:rPr>
           <w:b/>
@@ -31,7 +32,28 @@
           <w:sz w:val="38"/>
           <w:szCs w:val="38"/>
         </w:rPr>
-        <w:t>CÁC APP-WEB ĐÃ THỰC HIỆN</w:t>
+        <w:t xml:space="preserve">SÁCH  </w:t>
+      </w:r>
+      <w:r>
+        <w:rPr>
+          <w:b/>
+          <w:bCs/>
+          <w:color w:val="EE0000"/>
+          <w:sz w:val="38"/>
+          <w:szCs w:val="38"/>
+        </w:rPr>
+        <w:t>CÁC</w:t>
+      </w:r>
+      <w:proofErr w:type="gramEnd"/>
+      <w:r>
+        <w:rPr>
+          <w:b/>
+          <w:bCs/>
+          <w:color w:val="EE0000"/>
+          <w:sz w:val="38"/>
+          <w:szCs w:val="38"/>
+        </w:rPr>
+        <w:t xml:space="preserve"> APP-WEB ĐÃ THỰC HIỆN</w:t>
       </w:r>
     </w:p>
     <w:p>
@@ -104,7 +126,23 @@
           <w:b/>
           <w:bCs/>
         </w:rPr>
-        <w:t>APP WEB THEO DÕI QUẢN LÝ SALES  ĐI THĂM KHÁCH HÀNG</w:t>
+        <w:t xml:space="preserve">APP WEB THEO DÕI QUẢN LÝ </w:t>
+      </w:r>
+      <w:proofErr w:type="gramStart"/>
+      <w:r>
+        <w:rPr>
+          <w:b/>
+          <w:bCs/>
+        </w:rPr>
+        <w:t>SALES  ĐI</w:t>
+      </w:r>
+      <w:proofErr w:type="gramEnd"/>
+      <w:r>
+        <w:rPr>
+          <w:b/>
+          <w:bCs/>
+        </w:rPr>
+        <w:t xml:space="preserve"> THĂM KHÁCH HÀNG</w:t>
       </w:r>
     </w:p>
     <w:p>
@@ -615,14 +653,30 @@
           <w:b/>
           <w:bCs/>
         </w:rPr>
-        <w:t xml:space="preserve">APP WEB </w:t>
-      </w:r>
-      <w:r>
-        <w:rPr>
-          <w:b/>
-          <w:bCs/>
-        </w:rPr>
-        <w:t xml:space="preserve"> TAP DA LIEU &amp; LAM MỸ PHẨM </w:t>
+        <w:t xml:space="preserve">APP </w:t>
+      </w:r>
+      <w:proofErr w:type="gramStart"/>
+      <w:r>
+        <w:rPr>
+          <w:b/>
+          <w:bCs/>
+        </w:rPr>
+        <w:t xml:space="preserve">WEB </w:t>
+      </w:r>
+      <w:r>
+        <w:rPr>
+          <w:b/>
+          <w:bCs/>
+        </w:rPr>
+        <w:t xml:space="preserve"> TAP</w:t>
+      </w:r>
+      <w:proofErr w:type="gramEnd"/>
+      <w:r>
+        <w:rPr>
+          <w:b/>
+          <w:bCs/>
+        </w:rPr>
+        <w:t xml:space="preserve"> DA LIEU &amp; LAM MỸ PHẨM </w:t>
       </w:r>
       <w:r>
         <w:rPr>
@@ -843,18 +897,38 @@
     <w:p>
       <w:pPr>
         <w:pStyle w:val="ListParagraph"/>
-      </w:pPr>
-      <w:r>
+        <w:rPr>
+          <w:lang w:val="de-CH"/>
+        </w:rPr>
+      </w:pPr>
+      <w:r>
+        <w:rPr>
+          <w:lang w:val="de-CH"/>
+        </w:rPr>
         <w:t>link phu:  </w:t>
       </w:r>
-      <w:hyperlink r:id="rId26" w:history="1">
-        <w:r>
-          <w:rPr>
-            <w:rStyle w:val="Hyperlink"/>
-          </w:rPr>
-          <w:t>https://duy-anh-digital-lab.vercel.app</w:t>
-        </w:r>
-      </w:hyperlink>
+      <w:r>
+        <w:fldChar w:fldCharType="begin"/>
+      </w:r>
+      <w:r>
+        <w:rPr>
+          <w:lang w:val="de-CH"/>
+        </w:rPr>
+        <w:instrText>HYPERLINK "https://duy-anh-digital-lab.vercel.app/"</w:instrText>
+      </w:r>
+      <w:r>
+        <w:fldChar w:fldCharType="separate"/>
+      </w:r>
+      <w:r>
+        <w:rPr>
+          <w:rStyle w:val="Hyperlink"/>
+          <w:lang w:val="de-CH"/>
+        </w:rPr>
+        <w:t>https://duy-anh-digital-lab.vercel.app</w:t>
+      </w:r>
+      <w:r>
+        <w:fldChar w:fldCharType="end"/>
+      </w:r>
     </w:p>
     <w:p>
       <w:pPr>
@@ -866,12 +940,14 @@
         <w:rPr>
           <w:b/>
           <w:bCs/>
-        </w:rPr>
-      </w:pPr>
-      <w:r>
-        <w:rPr>
-          <w:b/>
-          <w:bCs/>
+          <w:lang w:val="de-CH"/>
+        </w:rPr>
+      </w:pPr>
+      <w:r>
+        <w:rPr>
+          <w:b/>
+          <w:bCs/>
+          <w:lang w:val="de-CH"/>
         </w:rPr>
         <w:t>APP WEB BÁO CÁO THUẾ HỘ KINH DOANH</w:t>
       </w:r>
@@ -880,7 +956,7 @@
       <w:pPr>
         <w:pStyle w:val="ListParagraph"/>
       </w:pPr>
-      <w:hyperlink r:id="rId27" w:history="1">
+      <w:hyperlink r:id="rId26" w:history="1">
         <w:r>
           <w:rPr>
             <w:rStyle w:val="Hyperlink"/>
@@ -913,7 +989,7 @@
       <w:pPr>
         <w:pStyle w:val="ListParagraph"/>
       </w:pPr>
-      <w:hyperlink r:id="rId28" w:history="1">
+      <w:hyperlink r:id="rId27" w:history="1">
         <w:r>
           <w:rPr>
             <w:rStyle w:val="Hyperlink"/>
@@ -946,7 +1022,7 @@
       <w:pPr>
         <w:pStyle w:val="ListParagraph"/>
       </w:pPr>
-      <w:hyperlink r:id="rId29" w:history="1">
+      <w:hyperlink r:id="rId28" w:history="1">
         <w:r>
           <w:rPr>
             <w:rStyle w:val="Hyperlink"/>
@@ -979,7 +1055,7 @@
       <w:pPr>
         <w:pStyle w:val="ListParagraph"/>
       </w:pPr>
-      <w:hyperlink r:id="rId30" w:history="1">
+      <w:hyperlink r:id="rId29" w:history="1">
         <w:r>
           <w:rPr>
             <w:rStyle w:val="Hyperlink"/>
@@ -1012,7 +1088,7 @@
       <w:pPr>
         <w:pStyle w:val="ListParagraph"/>
       </w:pPr>
-      <w:hyperlink r:id="rId31" w:history="1">
+      <w:hyperlink r:id="rId30" w:history="1">
         <w:r>
           <w:rPr>
             <w:rStyle w:val="Hyperlink"/>
@@ -1045,7 +1121,7 @@
       <w:pPr>
         <w:pStyle w:val="ListParagraph"/>
       </w:pPr>
-      <w:hyperlink r:id="rId32" w:history="1">
+      <w:hyperlink r:id="rId31" w:history="1">
         <w:r>
           <w:rPr>
             <w:rStyle w:val="Hyperlink"/>
@@ -1071,14 +1147,62 @@
           <w:b/>
           <w:bCs/>
         </w:rPr>
-        <w:t>APP QUẢN TRỊ RỦI RO XÉT NGHIỆM BỆNH VIỆN CHUẨN ISO 22367:2020, ISO 35001, GLP và Quyết định 2429/QĐ-BYT1731.</w:t>
-      </w:r>
-    </w:p>
-    <w:p>
-      <w:pPr>
-        <w:pStyle w:val="ListParagraph"/>
-      </w:pPr>
-      <w:hyperlink r:id="rId33" w:history="1">
+        <w:t xml:space="preserve">APP QUẢN TRỊ RỦI RO XÉT NGHIỆM BỆNH VIỆN CHUẨN ISO 22367:2020, ISO 35001, GLP </w:t>
+      </w:r>
+      <w:proofErr w:type="spellStart"/>
+      <w:r>
+        <w:rPr>
+          <w:b/>
+          <w:bCs/>
+        </w:rPr>
+        <w:t>và</w:t>
+      </w:r>
+      <w:proofErr w:type="spellEnd"/>
+      <w:r>
+        <w:rPr>
+          <w:b/>
+          <w:bCs/>
+        </w:rPr>
+        <w:t xml:space="preserve"> </w:t>
+      </w:r>
+      <w:proofErr w:type="spellStart"/>
+      <w:r>
+        <w:rPr>
+          <w:b/>
+          <w:bCs/>
+        </w:rPr>
+        <w:t>Quyết</w:t>
+      </w:r>
+      <w:proofErr w:type="spellEnd"/>
+      <w:r>
+        <w:rPr>
+          <w:b/>
+          <w:bCs/>
+        </w:rPr>
+        <w:t xml:space="preserve"> </w:t>
+      </w:r>
+      <w:proofErr w:type="spellStart"/>
+      <w:r>
+        <w:rPr>
+          <w:b/>
+          <w:bCs/>
+        </w:rPr>
+        <w:t>định</w:t>
+      </w:r>
+      <w:proofErr w:type="spellEnd"/>
+      <w:r>
+        <w:rPr>
+          <w:b/>
+          <w:bCs/>
+        </w:rPr>
+        <w:t xml:space="preserve"> 2429/QĐ-BYT1731.</w:t>
+      </w:r>
+    </w:p>
+    <w:p>
+      <w:pPr>
+        <w:pStyle w:val="ListParagraph"/>
+      </w:pPr>
+      <w:hyperlink r:id="rId32" w:history="1">
         <w:r>
           <w:rPr>
             <w:rStyle w:val="Hyperlink"/>
@@ -1134,7 +1258,7 @@
           <w:lang w:val="de-CH"/>
         </w:rPr>
       </w:pPr>
-      <w:hyperlink r:id="rId34" w:history="1">
+      <w:hyperlink r:id="rId33" w:history="1">
         <w:r>
           <w:rPr>
             <w:rStyle w:val="Hyperlink"/>
@@ -1186,7 +1310,7 @@
       <w:pPr>
         <w:pStyle w:val="ListParagraph"/>
       </w:pPr>
-      <w:hyperlink r:id="rId35" w:history="1">
+      <w:hyperlink r:id="rId34" w:history="1">
         <w:r>
           <w:rPr>
             <w:rStyle w:val="Hyperlink"/>
@@ -1236,7 +1360,7 @@
           <w:lang w:val="de-CH"/>
         </w:rPr>
       </w:pPr>
-      <w:hyperlink r:id="rId36" w:history="1">
+      <w:hyperlink r:id="rId35" w:history="1">
         <w:r>
           <w:rPr>
             <w:rStyle w:val="Hyperlink"/>
@@ -1244,12 +1368,14 @@
           </w:rPr>
           <w:t>https://</w:t>
         </w:r>
+        <w:proofErr w:type="spellStart"/>
         <w:r>
           <w:rPr>
             <w:rStyle w:val="Hyperlink"/>
           </w:rPr>
           <w:t>jpviet</w:t>
         </w:r>
+        <w:proofErr w:type="spellEnd"/>
         <w:r>
           <w:rPr>
             <w:rStyle w:val="Hyperlink"/>
@@ -1304,7 +1430,7 @@
           <w:lang w:val="de-CH"/>
         </w:rPr>
       </w:pPr>
-      <w:hyperlink r:id="rId37" w:history="1">
+      <w:hyperlink r:id="rId36" w:history="1">
         <w:r>
           <w:rPr>
             <w:rStyle w:val="Hyperlink"/>
@@ -1338,7 +1464,7 @@
       <w:pPr>
         <w:pStyle w:val="ListParagraph"/>
       </w:pPr>
-      <w:hyperlink r:id="rId38" w:history="1">
+      <w:hyperlink r:id="rId37" w:history="1">
         <w:r>
           <w:rPr>
             <w:rStyle w:val="Hyperlink"/>
@@ -1346,12 +1472,14 @@
           </w:rPr>
           <w:t>https://kr</w:t>
         </w:r>
+        <w:proofErr w:type="spellStart"/>
         <w:r>
           <w:rPr>
             <w:rStyle w:val="Hyperlink"/>
           </w:rPr>
           <w:t>viet</w:t>
         </w:r>
+        <w:proofErr w:type="spellEnd"/>
         <w:r>
           <w:rPr>
             <w:rStyle w:val="Hyperlink"/>
@@ -1402,7 +1530,7 @@
           <w:lang w:val="de-CH"/>
         </w:rPr>
       </w:pPr>
-      <w:hyperlink r:id="rId39" w:history="1">
+      <w:hyperlink r:id="rId38" w:history="1">
         <w:r>
           <w:rPr>
             <w:rStyle w:val="Hyperlink"/>
@@ -1410,12 +1538,14 @@
           </w:rPr>
           <w:t>https://</w:t>
         </w:r>
+        <w:proofErr w:type="spellStart"/>
         <w:r>
           <w:rPr>
             <w:rStyle w:val="Hyperlink"/>
           </w:rPr>
           <w:t>zhviet</w:t>
         </w:r>
+        <w:proofErr w:type="spellEnd"/>
         <w:r>
           <w:rPr>
             <w:rStyle w:val="Hyperlink"/>
@@ -1484,7 +1614,7 @@
       <w:pPr>
         <w:pStyle w:val="ListParagraph"/>
       </w:pPr>
-      <w:hyperlink r:id="rId40" w:history="1">
+      <w:hyperlink r:id="rId39" w:history="1">
         <w:r>
           <w:rPr>
             <w:rStyle w:val="Hyperlink"/>
@@ -1492,12 +1622,14 @@
           </w:rPr>
           <w:t>https://</w:t>
         </w:r>
+        <w:proofErr w:type="spellStart"/>
         <w:r>
           <w:rPr>
             <w:rStyle w:val="Hyperlink"/>
           </w:rPr>
           <w:t>usviet</w:t>
         </w:r>
+        <w:proofErr w:type="spellEnd"/>
         <w:r>
           <w:rPr>
             <w:rStyle w:val="Hyperlink"/>
@@ -1548,7 +1680,7 @@
           <w:lang w:val="de-CH"/>
         </w:rPr>
       </w:pPr>
-      <w:hyperlink r:id="rId41" w:history="1">
+      <w:hyperlink r:id="rId40" w:history="1">
         <w:r>
           <w:rPr>
             <w:rStyle w:val="Hyperlink"/>
@@ -1556,12 +1688,14 @@
           </w:rPr>
           <w:t>https://</w:t>
         </w:r>
+        <w:proofErr w:type="spellStart"/>
         <w:r>
           <w:rPr>
             <w:rStyle w:val="Hyperlink"/>
           </w:rPr>
           <w:t>frviet</w:t>
         </w:r>
+        <w:proofErr w:type="spellEnd"/>
         <w:r>
           <w:rPr>
             <w:rStyle w:val="Hyperlink"/>
@@ -1616,7 +1750,7 @@
           <w:lang w:val="de-CH"/>
         </w:rPr>
       </w:pPr>
-      <w:hyperlink r:id="rId42" w:history="1">
+      <w:hyperlink r:id="rId41" w:history="1">
         <w:r>
           <w:rPr>
             <w:rStyle w:val="Hyperlink"/>
@@ -1624,12 +1758,14 @@
           </w:rPr>
           <w:t>https://</w:t>
         </w:r>
+        <w:proofErr w:type="spellStart"/>
         <w:r>
           <w:rPr>
             <w:rStyle w:val="Hyperlink"/>
           </w:rPr>
           <w:t>deviet</w:t>
         </w:r>
+        <w:proofErr w:type="spellEnd"/>
         <w:r>
           <w:rPr>
             <w:rStyle w:val="Hyperlink"/>
@@ -1684,7 +1820,7 @@
           <w:lang w:val="de-CH"/>
         </w:rPr>
       </w:pPr>
-      <w:hyperlink r:id="rId43" w:history="1">
+      <w:hyperlink r:id="rId42" w:history="1">
         <w:r>
           <w:rPr>
             <w:rStyle w:val="Hyperlink"/>
@@ -1692,12 +1828,14 @@
           </w:rPr>
           <w:t>https://</w:t>
         </w:r>
+        <w:proofErr w:type="spellStart"/>
         <w:r>
           <w:rPr>
             <w:rStyle w:val="Hyperlink"/>
           </w:rPr>
           <w:t>ruviet</w:t>
         </w:r>
+        <w:proofErr w:type="spellEnd"/>
         <w:r>
           <w:rPr>
             <w:rStyle w:val="Hyperlink"/>
@@ -1768,7 +1906,7 @@
           <w:lang w:val="de-CH"/>
         </w:rPr>
       </w:pPr>
-      <w:hyperlink r:id="rId44" w:history="1">
+      <w:hyperlink r:id="rId43" w:history="1">
         <w:r>
           <w:rPr>
             <w:rStyle w:val="Hyperlink"/>
@@ -1776,12 +1914,14 @@
           </w:rPr>
           <w:t>https://</w:t>
         </w:r>
+        <w:proofErr w:type="spellStart"/>
         <w:r>
           <w:rPr>
             <w:rStyle w:val="Hyperlink"/>
           </w:rPr>
           <w:t>khviet</w:t>
         </w:r>
+        <w:proofErr w:type="spellEnd"/>
         <w:r>
           <w:rPr>
             <w:rStyle w:val="Hyperlink"/>
@@ -1836,7 +1976,7 @@
           <w:lang w:val="de-CH"/>
         </w:rPr>
       </w:pPr>
-      <w:hyperlink r:id="rId45" w:history="1">
+      <w:hyperlink r:id="rId44" w:history="1">
         <w:r>
           <w:rPr>
             <w:rStyle w:val="Hyperlink"/>
@@ -1844,12 +1984,14 @@
           </w:rPr>
           <w:t>https://</w:t>
         </w:r>
-        <w:r>
-          <w:rPr>
-            <w:rStyle w:val="Hyperlink"/>
-          </w:rPr>
-          <w:t>laviet</w:t>
-        </w:r>
+        <w:proofErr w:type="spellStart"/>
+        <w:r>
+          <w:rPr>
+            <w:rStyle w:val="Hyperlink"/>
+          </w:rPr>
+          <w:t>laoviet</w:t>
+        </w:r>
+        <w:proofErr w:type="spellEnd"/>
         <w:r>
           <w:rPr>
             <w:rStyle w:val="Hyperlink"/>
@@ -1904,7 +2046,7 @@
           <w:lang w:val="de-CH"/>
         </w:rPr>
       </w:pPr>
-      <w:hyperlink r:id="rId46" w:history="1">
+      <w:hyperlink r:id="rId45" w:history="1">
         <w:r>
           <w:rPr>
             <w:rStyle w:val="Hyperlink"/>
@@ -1912,12 +2054,14 @@
           </w:rPr>
           <w:t>https://</w:t>
         </w:r>
+        <w:proofErr w:type="spellStart"/>
         <w:r>
           <w:rPr>
             <w:rStyle w:val="Hyperlink"/>
           </w:rPr>
           <w:t>inviet</w:t>
         </w:r>
+        <w:proofErr w:type="spellEnd"/>
         <w:r>
           <w:rPr>
             <w:rStyle w:val="Hyperlink"/>
@@ -1972,7 +2116,7 @@
           <w:lang w:val="de-CH"/>
         </w:rPr>
       </w:pPr>
-      <w:hyperlink r:id="rId47" w:history="1">
+      <w:hyperlink r:id="rId46" w:history="1">
         <w:r>
           <w:rPr>
             <w:rStyle w:val="Hyperlink"/>
@@ -1980,12 +2124,14 @@
           </w:rPr>
           <w:t>https://</w:t>
         </w:r>
+        <w:proofErr w:type="spellStart"/>
         <w:r>
           <w:rPr>
             <w:rStyle w:val="Hyperlink"/>
           </w:rPr>
           <w:t>esviet</w:t>
         </w:r>
+        <w:proofErr w:type="spellEnd"/>
         <w:r>
           <w:rPr>
             <w:rStyle w:val="Hyperlink"/>
@@ -2040,7 +2186,7 @@
           <w:lang w:val="de-CH"/>
         </w:rPr>
       </w:pPr>
-      <w:hyperlink r:id="rId48" w:history="1">
+      <w:hyperlink r:id="rId47" w:history="1">
         <w:r>
           <w:rPr>
             <w:rStyle w:val="Hyperlink"/>
@@ -2079,7 +2225,7 @@
           <w:lang w:val="de-CH"/>
         </w:rPr>
       </w:pPr>
-      <w:hyperlink r:id="rId49" w:history="1">
+      <w:hyperlink r:id="rId48" w:history="1">
         <w:r>
           <w:rPr>
             <w:rStyle w:val="Hyperlink"/>
@@ -2115,7 +2261,7 @@
       <w:pPr>
         <w:pStyle w:val="ListParagraph"/>
       </w:pPr>
-      <w:hyperlink r:id="rId50" w:history="1">
+      <w:hyperlink r:id="rId49" w:history="1">
         <w:r>
           <w:rPr>
             <w:rStyle w:val="Hyperlink"/>
@@ -2152,7 +2298,7 @@
           <w:lang w:val="de-CH"/>
         </w:rPr>
       </w:pPr>
-      <w:hyperlink r:id="rId51" w:history="1">
+      <w:hyperlink r:id="rId50" w:history="1">
         <w:r>
           <w:rPr>
             <w:rStyle w:val="Hyperlink"/>
@@ -2192,7 +2338,7 @@
           <w:lang w:val="de-CH"/>
         </w:rPr>
       </w:pPr>
-      <w:hyperlink r:id="rId52" w:history="1">
+      <w:hyperlink r:id="rId51" w:history="1">
         <w:r>
           <w:rPr>
             <w:rStyle w:val="Hyperlink"/>
@@ -2232,15 +2378,327 @@
           <w:lang w:val="de-CH"/>
         </w:rPr>
       </w:pPr>
+      <w:hyperlink r:id="rId52" w:history="1">
+        <w:r>
+          <w:rPr>
+            <w:rStyle w:val="Hyperlink"/>
+            <w:lang w:val="de-CH"/>
+          </w:rPr>
+          <w:t>https://vietnuti.vercel.app/</w:t>
+        </w:r>
+      </w:hyperlink>
+    </w:p>
+    <w:p>
+      <w:pPr>
+        <w:pStyle w:val="ListParagraph"/>
+        <w:numPr>
+          <w:ilvl w:val="0"/>
+          <w:numId w:val="1"/>
+        </w:numPr>
+        <w:rPr>
+          <w:b/>
+          <w:bCs/>
+          <w:lang w:val="de-CH"/>
+        </w:rPr>
+      </w:pPr>
+      <w:r>
+        <w:rPr>
+          <w:b/>
+          <w:bCs/>
+          <w:lang w:val="de-CH"/>
+        </w:rPr>
+        <w:t>ỨNG DỤNG SẮP LỊCH CA TRỰC B</w:t>
+      </w:r>
+      <w:r>
+        <w:rPr>
+          <w:b/>
+          <w:bCs/>
+          <w:lang w:val="de-CH"/>
+        </w:rPr>
+        <w:t>ỆNH VIỆN</w:t>
+      </w:r>
+    </w:p>
+    <w:p>
+      <w:pPr>
+        <w:pStyle w:val="ListParagraph"/>
+        <w:ind w:left="1211"/>
+      </w:pPr>
       <w:hyperlink r:id="rId53" w:history="1">
         <w:r>
           <w:rPr>
             <w:rStyle w:val="Hyperlink"/>
-            <w:lang w:val="de-CH"/>
-          </w:rPr>
-          <w:t>https://vietnuti.vercel.app/</w:t>
-        </w:r>
-      </w:hyperlink>
+          </w:rPr>
+          <w:t>https://lichtruckxn.vercel.app</w:t>
+        </w:r>
+      </w:hyperlink>
+    </w:p>
+    <w:p>
+      <w:pPr>
+        <w:numPr>
+          <w:ilvl w:val="1"/>
+          <w:numId w:val="6"/>
+        </w:numPr>
+        <w:jc w:val="both"/>
+      </w:pPr>
+      <w:proofErr w:type="spellStart"/>
+      <w:r>
+        <w:rPr>
+          <w:b/>
+          <w:bCs/>
+        </w:rPr>
+        <w:t>Tên</w:t>
+      </w:r>
+      <w:proofErr w:type="spellEnd"/>
+      <w:r>
+        <w:rPr>
+          <w:b/>
+          <w:bCs/>
+        </w:rPr>
+        <w:t xml:space="preserve"> </w:t>
+      </w:r>
+      <w:proofErr w:type="spellStart"/>
+      <w:r>
+        <w:rPr>
+          <w:b/>
+          <w:bCs/>
+        </w:rPr>
+        <w:t>đăng</w:t>
+      </w:r>
+      <w:proofErr w:type="spellEnd"/>
+      <w:r>
+        <w:rPr>
+          <w:b/>
+          <w:bCs/>
+        </w:rPr>
+        <w:t xml:space="preserve"> </w:t>
+      </w:r>
+      <w:proofErr w:type="spellStart"/>
+      <w:r>
+        <w:rPr>
+          <w:b/>
+          <w:bCs/>
+        </w:rPr>
+        <w:t>nhập</w:t>
+      </w:r>
+      <w:proofErr w:type="spellEnd"/>
+      <w:r>
+        <w:rPr>
+          <w:b/>
+          <w:bCs/>
+        </w:rPr>
+        <w:t>:</w:t>
+      </w:r>
+      <w:r>
+        <w:t xml:space="preserve"> </w:t>
+      </w:r>
+      <w:proofErr w:type="spellStart"/>
+      <w:r>
+        <w:t>Quynhnga</w:t>
+      </w:r>
+      <w:proofErr w:type="spellEnd"/>
+    </w:p>
+    <w:p>
+      <w:pPr>
+        <w:numPr>
+          <w:ilvl w:val="1"/>
+          <w:numId w:val="6"/>
+        </w:numPr>
+        <w:jc w:val="both"/>
+      </w:pPr>
+      <w:proofErr w:type="spellStart"/>
+      <w:r>
+        <w:rPr>
+          <w:b/>
+          <w:bCs/>
+        </w:rPr>
+        <w:t>Mật</w:t>
+      </w:r>
+      <w:proofErr w:type="spellEnd"/>
+      <w:r>
+        <w:rPr>
+          <w:b/>
+          <w:bCs/>
+        </w:rPr>
+        <w:t xml:space="preserve"> </w:t>
+      </w:r>
+      <w:proofErr w:type="spellStart"/>
+      <w:r>
+        <w:rPr>
+          <w:b/>
+          <w:bCs/>
+        </w:rPr>
+        <w:t>khẩu</w:t>
+      </w:r>
+      <w:proofErr w:type="spellEnd"/>
+      <w:r>
+        <w:rPr>
+          <w:b/>
+          <w:bCs/>
+        </w:rPr>
+        <w:t>:</w:t>
+      </w:r>
+      <w:r>
+        <w:t xml:space="preserve"> Nganguyen1983!</w:t>
+      </w:r>
+    </w:p>
+    <w:p>
+      <w:pPr>
+        <w:pStyle w:val="ListParagraph"/>
+        <w:numPr>
+          <w:ilvl w:val="0"/>
+          <w:numId w:val="1"/>
+        </w:numPr>
+        <w:jc w:val="both"/>
+        <w:rPr>
+          <w:b/>
+          <w:bCs/>
+        </w:rPr>
+      </w:pPr>
+      <w:r>
+        <w:rPr>
+          <w:b/>
+          <w:bCs/>
+        </w:rPr>
+        <w:t xml:space="preserve">ỨNG DỤNG </w:t>
+      </w:r>
+      <w:proofErr w:type="spellStart"/>
+      <w:r>
+        <w:rPr>
+          <w:b/>
+          <w:bCs/>
+        </w:rPr>
+        <w:t>VietNail</w:t>
+      </w:r>
+      <w:proofErr w:type="spellEnd"/>
+      <w:r>
+        <w:rPr>
+          <w:b/>
+          <w:bCs/>
+        </w:rPr>
+        <w:t xml:space="preserve"> Guide</w:t>
+      </w:r>
+    </w:p>
+    <w:p>
+      <w:pPr>
+        <w:ind w:left="851"/>
+        <w:jc w:val="both"/>
+      </w:pPr>
+      <w:proofErr w:type="spellStart"/>
+      <w:r>
+        <w:t>Cẩm</w:t>
+      </w:r>
+      <w:proofErr w:type="spellEnd"/>
+      <w:r>
+        <w:t xml:space="preserve"> </w:t>
+      </w:r>
+      <w:proofErr w:type="spellStart"/>
+      <w:r>
+        <w:t>nang</w:t>
+      </w:r>
+      <w:proofErr w:type="spellEnd"/>
+      <w:r>
+        <w:t xml:space="preserve"> </w:t>
+      </w:r>
+      <w:proofErr w:type="spellStart"/>
+      <w:r>
+        <w:t>nghề</w:t>
+      </w:r>
+      <w:proofErr w:type="spellEnd"/>
+      <w:r>
+        <w:t xml:space="preserve"> nail </w:t>
+      </w:r>
+      <w:proofErr w:type="spellStart"/>
+      <w:r>
+        <w:t>tại</w:t>
+      </w:r>
+      <w:proofErr w:type="spellEnd"/>
+      <w:r>
+        <w:t xml:space="preserve"> </w:t>
+      </w:r>
+      <w:proofErr w:type="spellStart"/>
+      <w:r>
+        <w:t>Mỹ</w:t>
+      </w:r>
+      <w:proofErr w:type="spellEnd"/>
+      <w:r>
+        <w:t xml:space="preserve"> </w:t>
+      </w:r>
+      <w:proofErr w:type="spellStart"/>
+      <w:r>
+        <w:t>bằng</w:t>
+      </w:r>
+      <w:proofErr w:type="spellEnd"/>
+      <w:r>
+        <w:t xml:space="preserve"> </w:t>
+      </w:r>
+      <w:proofErr w:type="spellStart"/>
+      <w:r>
+        <w:t>tiếng</w:t>
+      </w:r>
+      <w:proofErr w:type="spellEnd"/>
+      <w:r>
+        <w:t xml:space="preserve"> Việt — </w:t>
+      </w:r>
+      <w:proofErr w:type="spellStart"/>
+      <w:r>
+        <w:t>chỉ</w:t>
+      </w:r>
+      <w:proofErr w:type="spellEnd"/>
+      <w:r>
+        <w:t xml:space="preserve"> </w:t>
+      </w:r>
+      <w:proofErr w:type="spellStart"/>
+      <w:r>
+        <w:t>đường</w:t>
+      </w:r>
+      <w:proofErr w:type="spellEnd"/>
+      <w:r>
+        <w:t xml:space="preserve"> </w:t>
+      </w:r>
+      <w:proofErr w:type="spellStart"/>
+      <w:r>
+        <w:t>từng</w:t>
+      </w:r>
+      <w:proofErr w:type="spellEnd"/>
+      <w:r>
+        <w:t xml:space="preserve"> </w:t>
+      </w:r>
+      <w:proofErr w:type="spellStart"/>
+      <w:r>
+        <w:t>bước</w:t>
+      </w:r>
+      <w:proofErr w:type="spellEnd"/>
+      <w:r>
+        <w:t xml:space="preserve">, </w:t>
+      </w:r>
+      <w:proofErr w:type="spellStart"/>
+      <w:r>
+        <w:t>mọi</w:t>
+      </w:r>
+      <w:proofErr w:type="spellEnd"/>
+      <w:r>
+        <w:t> </w:t>
+      </w:r>
+    </w:p>
+    <w:p>
+      <w:pPr>
+        <w:ind w:firstLine="720"/>
+        <w:jc w:val="both"/>
+      </w:pPr>
+      <w:hyperlink r:id="rId54" w:history="1">
+        <w:r>
+          <w:rPr>
+            <w:rStyle w:val="Hyperlink"/>
+          </w:rPr>
+          <w:t>https://vietnail.vercel.app</w:t>
+        </w:r>
+      </w:hyperlink>
+    </w:p>
+    <w:p>
+      <w:pPr>
+        <w:ind w:firstLine="720"/>
+        <w:jc w:val="both"/>
+      </w:pPr>
     </w:p>
     <w:p>
       <w:pPr>
@@ -2449,6 +2907,155 @@
     </w:lvl>
   </w:abstractNum>
   <w:abstractNum w:abstractNumId="2" w15:restartNumberingAfterBreak="0">
+    <w:nsid w:val="325E7706"/>
+    <w:multiLevelType w:val="multilevel"/>
+    <w:tmpl w:val="ECE6D182"/>
+    <w:lvl w:ilvl="0">
+      <w:start w:val="1"/>
+      <w:numFmt w:val="bullet"/>
+      <w:lvlText w:val=""/>
+      <w:lvlJc w:val="left"/>
+      <w:pPr>
+        <w:tabs>
+          <w:tab w:val="num" w:pos="720"/>
+        </w:tabs>
+        <w:ind w:left="720" w:hanging="360"/>
+      </w:pPr>
+      <w:rPr>
+        <w:rFonts w:ascii="Symbol" w:hAnsi="Symbol" w:hint="default"/>
+        <w:sz w:val="20"/>
+      </w:rPr>
+    </w:lvl>
+    <w:lvl w:ilvl="1">
+      <w:start w:val="1"/>
+      <w:numFmt w:val="bullet"/>
+      <w:lvlText w:val="o"/>
+      <w:lvlJc w:val="left"/>
+      <w:pPr>
+        <w:tabs>
+          <w:tab w:val="num" w:pos="1440"/>
+        </w:tabs>
+        <w:ind w:left="1440" w:hanging="360"/>
+      </w:pPr>
+      <w:rPr>
+        <w:rFonts w:ascii="Courier New" w:hAnsi="Courier New" w:hint="default"/>
+        <w:sz w:val="20"/>
+      </w:rPr>
+    </w:lvl>
+    <w:lvl w:ilvl="2" w:tentative="1">
+      <w:start w:val="1"/>
+      <w:numFmt w:val="bullet"/>
+      <w:lvlText w:val=""/>
+      <w:lvlJc w:val="left"/>
+      <w:pPr>
+        <w:tabs>
+          <w:tab w:val="num" w:pos="2160"/>
+        </w:tabs>
+        <w:ind w:left="2160" w:hanging="360"/>
+      </w:pPr>
+      <w:rPr>
+        <w:rFonts w:ascii="Wingdings" w:hAnsi="Wingdings" w:hint="default"/>
+        <w:sz w:val="20"/>
+      </w:rPr>
+    </w:lvl>
+    <w:lvl w:ilvl="3" w:tentative="1">
+      <w:start w:val="1"/>
+      <w:numFmt w:val="bullet"/>
+      <w:lvlText w:val=""/>
+      <w:lvlJc w:val="left"/>
+      <w:pPr>
+        <w:tabs>
+          <w:tab w:val="num" w:pos="2880"/>
+        </w:tabs>
+        <w:ind w:left="2880" w:hanging="360"/>
+      </w:pPr>
+      <w:rPr>
+        <w:rFonts w:ascii="Wingdings" w:hAnsi="Wingdings" w:hint="default"/>
+        <w:sz w:val="20"/>
+      </w:rPr>
+    </w:lvl>
+    <w:lvl w:ilvl="4" w:tentative="1">
+      <w:start w:val="1"/>
+      <w:numFmt w:val="bullet"/>
+      <w:lvlText w:val=""/>
+      <w:lvlJc w:val="left"/>
+      <w:pPr>
+        <w:tabs>
+          <w:tab w:val="num" w:pos="3600"/>
+        </w:tabs>
+        <w:ind w:left="3600" w:hanging="360"/>
+      </w:pPr>
+      <w:rPr>
+        <w:rFonts w:ascii="Wingdings" w:hAnsi="Wingdings" w:hint="default"/>
+        <w:sz w:val="20"/>
+      </w:rPr>
+    </w:lvl>
+    <w:lvl w:ilvl="5" w:tentative="1">
+      <w:start w:val="1"/>
+      <w:numFmt w:val="bullet"/>
+      <w:lvlText w:val=""/>
+      <w:lvlJc w:val="left"/>
+      <w:pPr>
+        <w:tabs>
+          <w:tab w:val="num" w:pos="4320"/>
+        </w:tabs>
+        <w:ind w:left="4320" w:hanging="360"/>
+      </w:pPr>
+      <w:rPr>
+        <w:rFonts w:ascii="Wingdings" w:hAnsi="Wingdings" w:hint="default"/>
+        <w:sz w:val="20"/>
+      </w:rPr>
+    </w:lvl>
+    <w:lvl w:ilvl="6" w:tentative="1">
+      <w:start w:val="1"/>
+      <w:numFmt w:val="bullet"/>
+      <w:lvlText w:val=""/>
+      <w:lvlJc w:val="left"/>
+      <w:pPr>
+        <w:tabs>
+          <w:tab w:val="num" w:pos="5040"/>
+        </w:tabs>
+        <w:ind w:left="5040" w:hanging="360"/>
+      </w:pPr>
+      <w:rPr>
+        <w:rFonts w:ascii="Wingdings" w:hAnsi="Wingdings" w:hint="default"/>
+        <w:sz w:val="20"/>
+      </w:rPr>
+    </w:lvl>
+    <w:lvl w:ilvl="7" w:tentative="1">
+      <w:start w:val="1"/>
+      <w:numFmt w:val="bullet"/>
+      <w:lvlText w:val=""/>
+      <w:lvlJc w:val="left"/>
+      <w:pPr>
+        <w:tabs>
+          <w:tab w:val="num" w:pos="5760"/>
+        </w:tabs>
+        <w:ind w:left="5760" w:hanging="360"/>
+      </w:pPr>
+      <w:rPr>
+        <w:rFonts w:ascii="Wingdings" w:hAnsi="Wingdings" w:hint="default"/>
+        <w:sz w:val="20"/>
+      </w:rPr>
+    </w:lvl>
+    <w:lvl w:ilvl="8" w:tentative="1">
+      <w:start w:val="1"/>
+      <w:numFmt w:val="bullet"/>
+      <w:lvlText w:val=""/>
+      <w:lvlJc w:val="left"/>
+      <w:pPr>
+        <w:tabs>
+          <w:tab w:val="num" w:pos="6480"/>
+        </w:tabs>
+        <w:ind w:left="6480" w:hanging="360"/>
+      </w:pPr>
+      <w:rPr>
+        <w:rFonts w:ascii="Wingdings" w:hAnsi="Wingdings" w:hint="default"/>
+        <w:sz w:val="20"/>
+      </w:rPr>
+    </w:lvl>
+  </w:abstractNum>
+  <w:abstractNum w:abstractNumId="3" w15:restartNumberingAfterBreak="0">
     <w:nsid w:val="39AF386A"/>
     <w:multiLevelType w:val="multilevel"/>
     <w:tmpl w:val="139A3DBE"/>
@@ -2597,7 +3204,7 @@
       </w:rPr>
     </w:lvl>
   </w:abstractNum>
-  <w:abstractNum w:abstractNumId="3" w15:restartNumberingAfterBreak="0">
+  <w:abstractNum w:abstractNumId="4" w15:restartNumberingAfterBreak="0">
     <w:nsid w:val="3CC516FF"/>
     <w:multiLevelType w:val="hybridMultilevel"/>
     <w:tmpl w:val="AF6E8432"/>
@@ -2686,7 +3293,7 @@
       </w:pPr>
     </w:lvl>
   </w:abstractNum>
-  <w:abstractNum w:abstractNumId="4" w15:restartNumberingAfterBreak="0">
+  <w:abstractNum w:abstractNumId="5" w15:restartNumberingAfterBreak="0">
     <w:nsid w:val="5844602D"/>
     <w:multiLevelType w:val="hybridMultilevel"/>
     <w:tmpl w:val="AF6E8432"/>
@@ -2779,16 +3386,19 @@
     <w:abstractNumId w:val="0"/>
   </w:num>
   <w:num w:numId="2" w16cid:durableId="222722018">
-    <w:abstractNumId w:val="2"/>
+    <w:abstractNumId w:val="3"/>
   </w:num>
   <w:num w:numId="3" w16cid:durableId="1505169164">
-    <w:abstractNumId w:val="4"/>
+    <w:abstractNumId w:val="5"/>
   </w:num>
   <w:num w:numId="4" w16cid:durableId="1680964081">
-    <w:abstractNumId w:val="3"/>
+    <w:abstractNumId w:val="4"/>
   </w:num>
   <w:num w:numId="5" w16cid:durableId="2089038939">
     <w:abstractNumId w:val="1"/>
+  </w:num>
+  <w:num w:numId="6" w16cid:durableId="334311646">
+    <w:abstractNumId w:val="2"/>
   </w:num>
 </w:numbering>
 </file>

</xml_diff>

<commit_message>
Them ung dung VietTutorz Gia Su AI Lop 1-12 vao landing page ungdung.vercel.app
</commit_message>
<xml_diff>
--- a/260826-DANH SACH CÁC APP WEB DA THUC HIEN.docx
+++ b/260826-DANH SACH CÁC APP WEB DA THUC HIEN.docx
@@ -897,38 +897,26 @@
     <w:p>
       <w:pPr>
         <w:pStyle w:val="ListParagraph"/>
-        <w:rPr>
-          <w:lang w:val="de-CH"/>
-        </w:rPr>
-      </w:pPr>
-      <w:r>
-        <w:rPr>
-          <w:lang w:val="de-CH"/>
-        </w:rPr>
-        <w:t>link phu:  </w:t>
-      </w:r>
-      <w:r>
-        <w:fldChar w:fldCharType="begin"/>
-      </w:r>
-      <w:r>
-        <w:rPr>
-          <w:lang w:val="de-CH"/>
-        </w:rPr>
-        <w:instrText>HYPERLINK "https://duy-anh-digital-lab.vercel.app/"</w:instrText>
-      </w:r>
-      <w:r>
-        <w:fldChar w:fldCharType="separate"/>
-      </w:r>
-      <w:r>
-        <w:rPr>
-          <w:rStyle w:val="Hyperlink"/>
-          <w:lang w:val="de-CH"/>
-        </w:rPr>
-        <w:t>https://duy-anh-digital-lab.vercel.app</w:t>
-      </w:r>
-      <w:r>
-        <w:fldChar w:fldCharType="end"/>
-      </w:r>
+      </w:pPr>
+      <w:r>
+        <w:t xml:space="preserve">link </w:t>
+      </w:r>
+      <w:proofErr w:type="spellStart"/>
+      <w:r>
+        <w:t>phu</w:t>
+      </w:r>
+      <w:proofErr w:type="spellEnd"/>
+      <w:r>
+        <w:t>:  </w:t>
+      </w:r>
+      <w:hyperlink r:id="rId26" w:history="1">
+        <w:r>
+          <w:rPr>
+            <w:rStyle w:val="Hyperlink"/>
+          </w:rPr>
+          <w:t>https://duy-anh-digital-lab.vercel.app</w:t>
+        </w:r>
+      </w:hyperlink>
     </w:p>
     <w:p>
       <w:pPr>
@@ -940,14 +928,12 @@
         <w:rPr>
           <w:b/>
           <w:bCs/>
-          <w:lang w:val="de-CH"/>
-        </w:rPr>
-      </w:pPr>
-      <w:r>
-        <w:rPr>
-          <w:b/>
-          <w:bCs/>
-          <w:lang w:val="de-CH"/>
+        </w:rPr>
+      </w:pPr>
+      <w:r>
+        <w:rPr>
+          <w:b/>
+          <w:bCs/>
         </w:rPr>
         <w:t>APP WEB BÁO CÁO THUẾ HỘ KINH DOANH</w:t>
       </w:r>
@@ -956,7 +942,7 @@
       <w:pPr>
         <w:pStyle w:val="ListParagraph"/>
       </w:pPr>
-      <w:hyperlink r:id="rId26" w:history="1">
+      <w:hyperlink r:id="rId27" w:history="1">
         <w:r>
           <w:rPr>
             <w:rStyle w:val="Hyperlink"/>
@@ -989,7 +975,7 @@
       <w:pPr>
         <w:pStyle w:val="ListParagraph"/>
       </w:pPr>
-      <w:hyperlink r:id="rId27" w:history="1">
+      <w:hyperlink r:id="rId28" w:history="1">
         <w:r>
           <w:rPr>
             <w:rStyle w:val="Hyperlink"/>
@@ -1022,7 +1008,7 @@
       <w:pPr>
         <w:pStyle w:val="ListParagraph"/>
       </w:pPr>
-      <w:hyperlink r:id="rId28" w:history="1">
+      <w:hyperlink r:id="rId29" w:history="1">
         <w:r>
           <w:rPr>
             <w:rStyle w:val="Hyperlink"/>
@@ -1055,7 +1041,7 @@
       <w:pPr>
         <w:pStyle w:val="ListParagraph"/>
       </w:pPr>
-      <w:hyperlink r:id="rId29" w:history="1">
+      <w:hyperlink r:id="rId30" w:history="1">
         <w:r>
           <w:rPr>
             <w:rStyle w:val="Hyperlink"/>
@@ -1088,7 +1074,7 @@
       <w:pPr>
         <w:pStyle w:val="ListParagraph"/>
       </w:pPr>
-      <w:hyperlink r:id="rId30" w:history="1">
+      <w:hyperlink r:id="rId31" w:history="1">
         <w:r>
           <w:rPr>
             <w:rStyle w:val="Hyperlink"/>
@@ -1121,7 +1107,7 @@
       <w:pPr>
         <w:pStyle w:val="ListParagraph"/>
       </w:pPr>
-      <w:hyperlink r:id="rId31" w:history="1">
+      <w:hyperlink r:id="rId32" w:history="1">
         <w:r>
           <w:rPr>
             <w:rStyle w:val="Hyperlink"/>
@@ -1202,7 +1188,7 @@
       <w:pPr>
         <w:pStyle w:val="ListParagraph"/>
       </w:pPr>
-      <w:hyperlink r:id="rId32" w:history="1">
+      <w:hyperlink r:id="rId33" w:history="1">
         <w:r>
           <w:rPr>
             <w:rStyle w:val="Hyperlink"/>
@@ -1258,7 +1244,7 @@
           <w:lang w:val="de-CH"/>
         </w:rPr>
       </w:pPr>
-      <w:hyperlink r:id="rId33" w:history="1">
+      <w:hyperlink r:id="rId34" w:history="1">
         <w:r>
           <w:rPr>
             <w:rStyle w:val="Hyperlink"/>
@@ -1310,7 +1296,7 @@
       <w:pPr>
         <w:pStyle w:val="ListParagraph"/>
       </w:pPr>
-      <w:hyperlink r:id="rId34" w:history="1">
+      <w:hyperlink r:id="rId35" w:history="1">
         <w:r>
           <w:rPr>
             <w:rStyle w:val="Hyperlink"/>
@@ -1360,7 +1346,7 @@
           <w:lang w:val="de-CH"/>
         </w:rPr>
       </w:pPr>
-      <w:hyperlink r:id="rId35" w:history="1">
+      <w:hyperlink r:id="rId36" w:history="1">
         <w:r>
           <w:rPr>
             <w:rStyle w:val="Hyperlink"/>
@@ -1430,7 +1416,7 @@
           <w:lang w:val="de-CH"/>
         </w:rPr>
       </w:pPr>
-      <w:hyperlink r:id="rId36" w:history="1">
+      <w:hyperlink r:id="rId37" w:history="1">
         <w:r>
           <w:rPr>
             <w:rStyle w:val="Hyperlink"/>
@@ -1464,7 +1450,7 @@
       <w:pPr>
         <w:pStyle w:val="ListParagraph"/>
       </w:pPr>
-      <w:hyperlink r:id="rId37" w:history="1">
+      <w:hyperlink r:id="rId38" w:history="1">
         <w:r>
           <w:rPr>
             <w:rStyle w:val="Hyperlink"/>
@@ -1530,7 +1516,7 @@
           <w:lang w:val="de-CH"/>
         </w:rPr>
       </w:pPr>
-      <w:hyperlink r:id="rId38" w:history="1">
+      <w:hyperlink r:id="rId39" w:history="1">
         <w:r>
           <w:rPr>
             <w:rStyle w:val="Hyperlink"/>
@@ -1614,7 +1600,7 @@
       <w:pPr>
         <w:pStyle w:val="ListParagraph"/>
       </w:pPr>
-      <w:hyperlink r:id="rId39" w:history="1">
+      <w:hyperlink r:id="rId40" w:history="1">
         <w:r>
           <w:rPr>
             <w:rStyle w:val="Hyperlink"/>
@@ -1680,7 +1666,7 @@
           <w:lang w:val="de-CH"/>
         </w:rPr>
       </w:pPr>
-      <w:hyperlink r:id="rId40" w:history="1">
+      <w:hyperlink r:id="rId41" w:history="1">
         <w:r>
           <w:rPr>
             <w:rStyle w:val="Hyperlink"/>
@@ -1750,7 +1736,7 @@
           <w:lang w:val="de-CH"/>
         </w:rPr>
       </w:pPr>
-      <w:hyperlink r:id="rId41" w:history="1">
+      <w:hyperlink r:id="rId42" w:history="1">
         <w:r>
           <w:rPr>
             <w:rStyle w:val="Hyperlink"/>
@@ -1820,7 +1806,7 @@
           <w:lang w:val="de-CH"/>
         </w:rPr>
       </w:pPr>
-      <w:hyperlink r:id="rId42" w:history="1">
+      <w:hyperlink r:id="rId43" w:history="1">
         <w:r>
           <w:rPr>
             <w:rStyle w:val="Hyperlink"/>
@@ -1906,7 +1892,7 @@
           <w:lang w:val="de-CH"/>
         </w:rPr>
       </w:pPr>
-      <w:hyperlink r:id="rId43" w:history="1">
+      <w:hyperlink r:id="rId44" w:history="1">
         <w:r>
           <w:rPr>
             <w:rStyle w:val="Hyperlink"/>
@@ -1976,7 +1962,7 @@
           <w:lang w:val="de-CH"/>
         </w:rPr>
       </w:pPr>
-      <w:hyperlink r:id="rId44" w:history="1">
+      <w:hyperlink r:id="rId45" w:history="1">
         <w:r>
           <w:rPr>
             <w:rStyle w:val="Hyperlink"/>
@@ -2046,7 +2032,7 @@
           <w:lang w:val="de-CH"/>
         </w:rPr>
       </w:pPr>
-      <w:hyperlink r:id="rId45" w:history="1">
+      <w:hyperlink r:id="rId46" w:history="1">
         <w:r>
           <w:rPr>
             <w:rStyle w:val="Hyperlink"/>
@@ -2116,7 +2102,7 @@
           <w:lang w:val="de-CH"/>
         </w:rPr>
       </w:pPr>
-      <w:hyperlink r:id="rId46" w:history="1">
+      <w:hyperlink r:id="rId47" w:history="1">
         <w:r>
           <w:rPr>
             <w:rStyle w:val="Hyperlink"/>
@@ -2186,7 +2172,7 @@
           <w:lang w:val="de-CH"/>
         </w:rPr>
       </w:pPr>
-      <w:hyperlink r:id="rId47" w:history="1">
+      <w:hyperlink r:id="rId48" w:history="1">
         <w:r>
           <w:rPr>
             <w:rStyle w:val="Hyperlink"/>
@@ -2225,7 +2211,7 @@
           <w:lang w:val="de-CH"/>
         </w:rPr>
       </w:pPr>
-      <w:hyperlink r:id="rId48" w:history="1">
+      <w:hyperlink r:id="rId49" w:history="1">
         <w:r>
           <w:rPr>
             <w:rStyle w:val="Hyperlink"/>
@@ -2261,7 +2247,7 @@
       <w:pPr>
         <w:pStyle w:val="ListParagraph"/>
       </w:pPr>
-      <w:hyperlink r:id="rId49" w:history="1">
+      <w:hyperlink r:id="rId50" w:history="1">
         <w:r>
           <w:rPr>
             <w:rStyle w:val="Hyperlink"/>
@@ -2298,7 +2284,7 @@
           <w:lang w:val="de-CH"/>
         </w:rPr>
       </w:pPr>
-      <w:hyperlink r:id="rId50" w:history="1">
+      <w:hyperlink r:id="rId51" w:history="1">
         <w:r>
           <w:rPr>
             <w:rStyle w:val="Hyperlink"/>
@@ -2338,7 +2324,7 @@
           <w:lang w:val="de-CH"/>
         </w:rPr>
       </w:pPr>
-      <w:hyperlink r:id="rId51" w:history="1">
+      <w:hyperlink r:id="rId52" w:history="1">
         <w:r>
           <w:rPr>
             <w:rStyle w:val="Hyperlink"/>
@@ -2378,7 +2364,7 @@
           <w:lang w:val="de-CH"/>
         </w:rPr>
       </w:pPr>
-      <w:hyperlink r:id="rId52" w:history="1">
+      <w:hyperlink r:id="rId53" w:history="1">
         <w:r>
           <w:rPr>
             <w:rStyle w:val="Hyperlink"/>
@@ -2423,7 +2409,7 @@
         <w:pStyle w:val="ListParagraph"/>
         <w:ind w:left="1211"/>
       </w:pPr>
-      <w:hyperlink r:id="rId53" w:history="1">
+      <w:hyperlink r:id="rId54" w:history="1">
         <w:r>
           <w:rPr>
             <w:rStyle w:val="Hyperlink"/>
@@ -2685,7 +2671,7 @@
         <w:ind w:firstLine="720"/>
         <w:jc w:val="both"/>
       </w:pPr>
-      <w:hyperlink r:id="rId54" w:history="1">
+      <w:hyperlink r:id="rId55" w:history="1">
         <w:r>
           <w:rPr>
             <w:rStyle w:val="Hyperlink"/>
@@ -2696,26 +2682,433 @@
     </w:p>
     <w:p>
       <w:pPr>
-        <w:ind w:firstLine="720"/>
+        <w:pStyle w:val="ListParagraph"/>
+        <w:numPr>
+          <w:ilvl w:val="0"/>
+          <w:numId w:val="1"/>
+        </w:numPr>
         <w:jc w:val="both"/>
-      </w:pPr>
+        <w:rPr>
+          <w:b/>
+          <w:bCs/>
+        </w:rPr>
+      </w:pPr>
+      <w:r>
+        <w:rPr>
+          <w:b/>
+          <w:bCs/>
+        </w:rPr>
+        <w:t>LANDING PAGE – VIET TUTOR</w:t>
+      </w:r>
     </w:p>
     <w:p>
       <w:pPr>
         <w:pStyle w:val="ListParagraph"/>
         <w:ind w:left="1211"/>
-        <w:rPr>
-          <w:lang w:val="de-CH"/>
-        </w:rPr>
-      </w:pPr>
-    </w:p>
-    <w:p>
-      <w:pPr>
-        <w:rPr>
-          <w:lang w:val="de-CH"/>
-        </w:rPr>
-      </w:pPr>
-    </w:p>
+        <w:jc w:val="both"/>
+      </w:pPr>
+      <w:hyperlink r:id="rId56" w:history="1">
+        <w:r>
+          <w:rPr>
+            <w:rStyle w:val="Hyperlink"/>
+          </w:rPr>
+          <w:t>https://vietgiasu.vercel.app</w:t>
+        </w:r>
+      </w:hyperlink>
+    </w:p>
+    <w:p>
+      <w:pPr>
+        <w:pStyle w:val="ListParagraph"/>
+        <w:numPr>
+          <w:ilvl w:val="0"/>
+          <w:numId w:val="1"/>
+        </w:numPr>
+        <w:jc w:val="both"/>
+      </w:pPr>
+      <w:r>
+        <w:t>ỨNG DỤNG GIA SƯ TỪ L</w:t>
+      </w:r>
+      <w:r>
+        <w:t>ỚP 1- LỚP 12</w:t>
+      </w:r>
+    </w:p>
+    <w:p>
+      <w:pPr>
+        <w:jc w:val="both"/>
+      </w:pPr>
+    </w:p>
+    <w:p>
+      <w:pPr>
+        <w:pStyle w:val="ListParagraph"/>
+        <w:numPr>
+          <w:ilvl w:val="0"/>
+          <w:numId w:val="8"/>
+        </w:numPr>
+        <w:jc w:val="both"/>
+      </w:pPr>
+      <w:hyperlink r:id="rId57" w:history="1">
+        <w:r>
+          <w:rPr>
+            <w:rStyle w:val="Hyperlink"/>
+          </w:rPr>
+          <w:t>https://vietgiasu</w:t>
+        </w:r>
+        <w:r>
+          <w:rPr>
+            <w:rStyle w:val="Hyperlink"/>
+          </w:rPr>
+          <w:t>1</w:t>
+        </w:r>
+        <w:r>
+          <w:rPr>
+            <w:rStyle w:val="Hyperlink"/>
+          </w:rPr>
+          <w:t>.vercel.app</w:t>
+        </w:r>
+      </w:hyperlink>
+    </w:p>
+    <w:p>
+      <w:pPr>
+        <w:pStyle w:val="ListParagraph"/>
+        <w:numPr>
+          <w:ilvl w:val="0"/>
+          <w:numId w:val="8"/>
+        </w:numPr>
+        <w:jc w:val="both"/>
+      </w:pPr>
+      <w:hyperlink r:id="rId58" w:history="1">
+        <w:r>
+          <w:rPr>
+            <w:rStyle w:val="Hyperlink"/>
+          </w:rPr>
+          <w:t>https://vietgiasu</w:t>
+        </w:r>
+        <w:r>
+          <w:rPr>
+            <w:rStyle w:val="Hyperlink"/>
+          </w:rPr>
+          <w:t>2</w:t>
+        </w:r>
+        <w:r>
+          <w:rPr>
+            <w:rStyle w:val="Hyperlink"/>
+          </w:rPr>
+          <w:t>.vercel.app</w:t>
+        </w:r>
+      </w:hyperlink>
+    </w:p>
+    <w:p>
+      <w:pPr>
+        <w:pStyle w:val="ListParagraph"/>
+        <w:numPr>
+          <w:ilvl w:val="0"/>
+          <w:numId w:val="8"/>
+        </w:numPr>
+        <w:jc w:val="both"/>
+      </w:pPr>
+      <w:hyperlink r:id="rId59" w:history="1">
+        <w:r>
+          <w:rPr>
+            <w:rStyle w:val="Hyperlink"/>
+          </w:rPr>
+          <w:t>https://vietgiasu</w:t>
+        </w:r>
+        <w:r>
+          <w:rPr>
+            <w:rStyle w:val="Hyperlink"/>
+          </w:rPr>
+          <w:t>3</w:t>
+        </w:r>
+        <w:r>
+          <w:rPr>
+            <w:rStyle w:val="Hyperlink"/>
+          </w:rPr>
+          <w:t>.vercel.app</w:t>
+        </w:r>
+      </w:hyperlink>
+    </w:p>
+    <w:p>
+      <w:pPr>
+        <w:pStyle w:val="ListParagraph"/>
+        <w:numPr>
+          <w:ilvl w:val="0"/>
+          <w:numId w:val="8"/>
+        </w:numPr>
+        <w:jc w:val="both"/>
+      </w:pPr>
+      <w:hyperlink r:id="rId60" w:history="1">
+        <w:r>
+          <w:rPr>
+            <w:rStyle w:val="Hyperlink"/>
+          </w:rPr>
+          <w:t>https://vietgiasu</w:t>
+        </w:r>
+        <w:r>
+          <w:rPr>
+            <w:rStyle w:val="Hyperlink"/>
+          </w:rPr>
+          <w:t>4</w:t>
+        </w:r>
+        <w:r>
+          <w:rPr>
+            <w:rStyle w:val="Hyperlink"/>
+          </w:rPr>
+          <w:t>.vercel.app</w:t>
+        </w:r>
+      </w:hyperlink>
+    </w:p>
+    <w:p>
+      <w:pPr>
+        <w:pStyle w:val="ListParagraph"/>
+        <w:numPr>
+          <w:ilvl w:val="0"/>
+          <w:numId w:val="8"/>
+        </w:numPr>
+        <w:jc w:val="both"/>
+      </w:pPr>
+      <w:hyperlink r:id="rId61" w:history="1">
+        <w:r>
+          <w:rPr>
+            <w:rStyle w:val="Hyperlink"/>
+          </w:rPr>
+          <w:t>https://vietgiasu</w:t>
+        </w:r>
+        <w:r>
+          <w:rPr>
+            <w:rStyle w:val="Hyperlink"/>
+          </w:rPr>
+          <w:t>5</w:t>
+        </w:r>
+        <w:r>
+          <w:rPr>
+            <w:rStyle w:val="Hyperlink"/>
+          </w:rPr>
+          <w:t>.vercel.app</w:t>
+        </w:r>
+      </w:hyperlink>
+    </w:p>
+    <w:p>
+      <w:pPr>
+        <w:pStyle w:val="ListParagraph"/>
+        <w:numPr>
+          <w:ilvl w:val="0"/>
+          <w:numId w:val="8"/>
+        </w:numPr>
+        <w:jc w:val="both"/>
+      </w:pPr>
+      <w:hyperlink r:id="rId62" w:history="1">
+        <w:r>
+          <w:rPr>
+            <w:rStyle w:val="Hyperlink"/>
+          </w:rPr>
+          <w:t>https://vietgiasu</w:t>
+        </w:r>
+        <w:r>
+          <w:rPr>
+            <w:rStyle w:val="Hyperlink"/>
+          </w:rPr>
+          <w:t>6</w:t>
+        </w:r>
+        <w:r>
+          <w:rPr>
+            <w:rStyle w:val="Hyperlink"/>
+          </w:rPr>
+          <w:t>.vercel.app</w:t>
+        </w:r>
+      </w:hyperlink>
+    </w:p>
+    <w:p>
+      <w:pPr>
+        <w:pStyle w:val="ListParagraph"/>
+        <w:numPr>
+          <w:ilvl w:val="0"/>
+          <w:numId w:val="8"/>
+        </w:numPr>
+        <w:jc w:val="both"/>
+      </w:pPr>
+      <w:hyperlink r:id="rId63" w:history="1">
+        <w:r>
+          <w:rPr>
+            <w:rStyle w:val="Hyperlink"/>
+          </w:rPr>
+          <w:t>https://vietgiasu</w:t>
+        </w:r>
+        <w:r>
+          <w:rPr>
+            <w:rStyle w:val="Hyperlink"/>
+          </w:rPr>
+          <w:t>7</w:t>
+        </w:r>
+        <w:r>
+          <w:rPr>
+            <w:rStyle w:val="Hyperlink"/>
+          </w:rPr>
+          <w:t>.vercel.app</w:t>
+        </w:r>
+      </w:hyperlink>
+    </w:p>
+    <w:p>
+      <w:pPr>
+        <w:pStyle w:val="ListParagraph"/>
+        <w:numPr>
+          <w:ilvl w:val="0"/>
+          <w:numId w:val="8"/>
+        </w:numPr>
+        <w:jc w:val="both"/>
+      </w:pPr>
+      <w:hyperlink r:id="rId64" w:history="1">
+        <w:r>
+          <w:rPr>
+            <w:rStyle w:val="Hyperlink"/>
+          </w:rPr>
+          <w:t>https://vietgiasu</w:t>
+        </w:r>
+        <w:r>
+          <w:rPr>
+            <w:rStyle w:val="Hyperlink"/>
+          </w:rPr>
+          <w:t>8</w:t>
+        </w:r>
+        <w:r>
+          <w:rPr>
+            <w:rStyle w:val="Hyperlink"/>
+          </w:rPr>
+          <w:t>.vercel.app</w:t>
+        </w:r>
+      </w:hyperlink>
+    </w:p>
+    <w:p>
+      <w:pPr>
+        <w:pStyle w:val="ListParagraph"/>
+        <w:numPr>
+          <w:ilvl w:val="0"/>
+          <w:numId w:val="8"/>
+        </w:numPr>
+        <w:jc w:val="both"/>
+      </w:pPr>
+      <w:hyperlink r:id="rId65" w:history="1">
+        <w:r>
+          <w:rPr>
+            <w:rStyle w:val="Hyperlink"/>
+          </w:rPr>
+          <w:t>https://vietgiasu</w:t>
+        </w:r>
+        <w:r>
+          <w:rPr>
+            <w:rStyle w:val="Hyperlink"/>
+          </w:rPr>
+          <w:t>9</w:t>
+        </w:r>
+        <w:r>
+          <w:rPr>
+            <w:rStyle w:val="Hyperlink"/>
+          </w:rPr>
+          <w:t>.vercel.app</w:t>
+        </w:r>
+      </w:hyperlink>
+    </w:p>
+    <w:p>
+      <w:pPr>
+        <w:pStyle w:val="ListParagraph"/>
+        <w:numPr>
+          <w:ilvl w:val="0"/>
+          <w:numId w:val="8"/>
+        </w:numPr>
+        <w:jc w:val="both"/>
+      </w:pPr>
+      <w:hyperlink r:id="rId66" w:history="1">
+        <w:r>
+          <w:rPr>
+            <w:rStyle w:val="Hyperlink"/>
+          </w:rPr>
+          <w:t>https://vietgiasu</w:t>
+        </w:r>
+        <w:r>
+          <w:rPr>
+            <w:rStyle w:val="Hyperlink"/>
+          </w:rPr>
+          <w:t>10</w:t>
+        </w:r>
+        <w:r>
+          <w:rPr>
+            <w:rStyle w:val="Hyperlink"/>
+          </w:rPr>
+          <w:t>.vercel.app</w:t>
+        </w:r>
+      </w:hyperlink>
+    </w:p>
+    <w:p>
+      <w:pPr>
+        <w:pStyle w:val="ListParagraph"/>
+        <w:numPr>
+          <w:ilvl w:val="0"/>
+          <w:numId w:val="8"/>
+        </w:numPr>
+        <w:jc w:val="both"/>
+      </w:pPr>
+      <w:hyperlink r:id="rId67" w:history="1">
+        <w:r>
+          <w:rPr>
+            <w:rStyle w:val="Hyperlink"/>
+          </w:rPr>
+          <w:t>https://vietgiasu</w:t>
+        </w:r>
+        <w:r>
+          <w:rPr>
+            <w:rStyle w:val="Hyperlink"/>
+          </w:rPr>
+          <w:t>11</w:t>
+        </w:r>
+        <w:r>
+          <w:rPr>
+            <w:rStyle w:val="Hyperlink"/>
+          </w:rPr>
+          <w:t>.vercel.app</w:t>
+        </w:r>
+      </w:hyperlink>
+    </w:p>
+    <w:p>
+      <w:pPr>
+        <w:pStyle w:val="ListParagraph"/>
+        <w:numPr>
+          <w:ilvl w:val="0"/>
+          <w:numId w:val="8"/>
+        </w:numPr>
+        <w:jc w:val="both"/>
+      </w:pPr>
+      <w:hyperlink r:id="rId68" w:history="1">
+        <w:r>
+          <w:rPr>
+            <w:rStyle w:val="Hyperlink"/>
+          </w:rPr>
+          <w:t>https://vietgiasu</w:t>
+        </w:r>
+        <w:r>
+          <w:rPr>
+            <w:rStyle w:val="Hyperlink"/>
+          </w:rPr>
+          <w:t>12</w:t>
+        </w:r>
+        <w:r>
+          <w:rPr>
+            <w:rStyle w:val="Hyperlink"/>
+          </w:rPr>
+          <w:t>.vercel.app</w:t>
+        </w:r>
+      </w:hyperlink>
+    </w:p>
+    <w:p>
+      <w:pPr>
+        <w:jc w:val="both"/>
+      </w:pPr>
+    </w:p>
+    <w:p>
+      <w:pPr>
+        <w:pStyle w:val="ListParagraph"/>
+        <w:ind w:left="1211"/>
+      </w:pPr>
+    </w:p>
+    <w:p/>
     <w:sectPr>
       <w:pgSz w:w="12240" w:h="15840"/>
       <w:pgMar w:top="993" w:right="1440" w:bottom="426" w:left="1440" w:header="720" w:footer="720" w:gutter="0"/>
@@ -3056,6 +3449,92 @@
     </w:lvl>
   </w:abstractNum>
   <w:abstractNum w:abstractNumId="3" w15:restartNumberingAfterBreak="0">
+    <w:nsid w:val="35680CB4"/>
+    <w:multiLevelType w:val="hybridMultilevel"/>
+    <w:tmpl w:val="03EE2D78"/>
+    <w:lvl w:ilvl="0" w:tplc="0409000F">
+      <w:start w:val="1"/>
+      <w:numFmt w:val="decimal"/>
+      <w:lvlText w:val="%1."/>
+      <w:lvlJc w:val="left"/>
+      <w:pPr>
+        <w:ind w:left="1931" w:hanging="360"/>
+      </w:pPr>
+    </w:lvl>
+    <w:lvl w:ilvl="1" w:tplc="04090019" w:tentative="1">
+      <w:start w:val="1"/>
+      <w:numFmt w:val="lowerLetter"/>
+      <w:lvlText w:val="%2."/>
+      <w:lvlJc w:val="left"/>
+      <w:pPr>
+        <w:ind w:left="2651" w:hanging="360"/>
+      </w:pPr>
+    </w:lvl>
+    <w:lvl w:ilvl="2" w:tplc="0409001B" w:tentative="1">
+      <w:start w:val="1"/>
+      <w:numFmt w:val="lowerRoman"/>
+      <w:lvlText w:val="%3."/>
+      <w:lvlJc w:val="right"/>
+      <w:pPr>
+        <w:ind w:left="3371" w:hanging="180"/>
+      </w:pPr>
+    </w:lvl>
+    <w:lvl w:ilvl="3" w:tplc="0409000F" w:tentative="1">
+      <w:start w:val="1"/>
+      <w:numFmt w:val="decimal"/>
+      <w:lvlText w:val="%4."/>
+      <w:lvlJc w:val="left"/>
+      <w:pPr>
+        <w:ind w:left="4091" w:hanging="360"/>
+      </w:pPr>
+    </w:lvl>
+    <w:lvl w:ilvl="4" w:tplc="04090019" w:tentative="1">
+      <w:start w:val="1"/>
+      <w:numFmt w:val="lowerLetter"/>
+      <w:lvlText w:val="%5."/>
+      <w:lvlJc w:val="left"/>
+      <w:pPr>
+        <w:ind w:left="4811" w:hanging="360"/>
+      </w:pPr>
+    </w:lvl>
+    <w:lvl w:ilvl="5" w:tplc="0409001B" w:tentative="1">
+      <w:start w:val="1"/>
+      <w:numFmt w:val="lowerRoman"/>
+      <w:lvlText w:val="%6."/>
+      <w:lvlJc w:val="right"/>
+      <w:pPr>
+        <w:ind w:left="5531" w:hanging="180"/>
+      </w:pPr>
+    </w:lvl>
+    <w:lvl w:ilvl="6" w:tplc="0409000F" w:tentative="1">
+      <w:start w:val="1"/>
+      <w:numFmt w:val="decimal"/>
+      <w:lvlText w:val="%7."/>
+      <w:lvlJc w:val="left"/>
+      <w:pPr>
+        <w:ind w:left="6251" w:hanging="360"/>
+      </w:pPr>
+    </w:lvl>
+    <w:lvl w:ilvl="7" w:tplc="04090019" w:tentative="1">
+      <w:start w:val="1"/>
+      <w:numFmt w:val="lowerLetter"/>
+      <w:lvlText w:val="%8."/>
+      <w:lvlJc w:val="left"/>
+      <w:pPr>
+        <w:ind w:left="6971" w:hanging="360"/>
+      </w:pPr>
+    </w:lvl>
+    <w:lvl w:ilvl="8" w:tplc="0409001B" w:tentative="1">
+      <w:start w:val="1"/>
+      <w:numFmt w:val="lowerRoman"/>
+      <w:lvlText w:val="%9."/>
+      <w:lvlJc w:val="right"/>
+      <w:pPr>
+        <w:ind w:left="7691" w:hanging="180"/>
+      </w:pPr>
+    </w:lvl>
+  </w:abstractNum>
+  <w:abstractNum w:abstractNumId="4" w15:restartNumberingAfterBreak="0">
     <w:nsid w:val="39AF386A"/>
     <w:multiLevelType w:val="multilevel"/>
     <w:tmpl w:val="139A3DBE"/>
@@ -3204,7 +3683,7 @@
       </w:rPr>
     </w:lvl>
   </w:abstractNum>
-  <w:abstractNum w:abstractNumId="4" w15:restartNumberingAfterBreak="0">
+  <w:abstractNum w:abstractNumId="5" w15:restartNumberingAfterBreak="0">
     <w:nsid w:val="3CC516FF"/>
     <w:multiLevelType w:val="hybridMultilevel"/>
     <w:tmpl w:val="AF6E8432"/>
@@ -3293,7 +3772,96 @@
       </w:pPr>
     </w:lvl>
   </w:abstractNum>
-  <w:abstractNum w:abstractNumId="5" w15:restartNumberingAfterBreak="0">
+  <w:abstractNum w:abstractNumId="6" w15:restartNumberingAfterBreak="0">
+    <w:nsid w:val="49D76E85"/>
+    <w:multiLevelType w:val="hybridMultilevel"/>
+    <w:tmpl w:val="AF6E8432"/>
+    <w:lvl w:ilvl="0" w:tplc="FFFFFFFF">
+      <w:start w:val="1"/>
+      <w:numFmt w:val="decimal"/>
+      <w:lvlText w:val="%1."/>
+      <w:lvlJc w:val="left"/>
+      <w:pPr>
+        <w:ind w:left="1211" w:hanging="360"/>
+      </w:pPr>
+      <w:rPr>
+        <w:rFonts w:hint="default"/>
+      </w:rPr>
+    </w:lvl>
+    <w:lvl w:ilvl="1" w:tplc="FFFFFFFF" w:tentative="1">
+      <w:start w:val="1"/>
+      <w:numFmt w:val="lowerLetter"/>
+      <w:lvlText w:val="%2."/>
+      <w:lvlJc w:val="left"/>
+      <w:pPr>
+        <w:ind w:left="1440" w:hanging="360"/>
+      </w:pPr>
+    </w:lvl>
+    <w:lvl w:ilvl="2" w:tplc="FFFFFFFF" w:tentative="1">
+      <w:start w:val="1"/>
+      <w:numFmt w:val="lowerRoman"/>
+      <w:lvlText w:val="%3."/>
+      <w:lvlJc w:val="right"/>
+      <w:pPr>
+        <w:ind w:left="2160" w:hanging="180"/>
+      </w:pPr>
+    </w:lvl>
+    <w:lvl w:ilvl="3" w:tplc="FFFFFFFF" w:tentative="1">
+      <w:start w:val="1"/>
+      <w:numFmt w:val="decimal"/>
+      <w:lvlText w:val="%4."/>
+      <w:lvlJc w:val="left"/>
+      <w:pPr>
+        <w:ind w:left="2880" w:hanging="360"/>
+      </w:pPr>
+    </w:lvl>
+    <w:lvl w:ilvl="4" w:tplc="FFFFFFFF" w:tentative="1">
+      <w:start w:val="1"/>
+      <w:numFmt w:val="lowerLetter"/>
+      <w:lvlText w:val="%5."/>
+      <w:lvlJc w:val="left"/>
+      <w:pPr>
+        <w:ind w:left="3600" w:hanging="360"/>
+      </w:pPr>
+    </w:lvl>
+    <w:lvl w:ilvl="5" w:tplc="FFFFFFFF" w:tentative="1">
+      <w:start w:val="1"/>
+      <w:numFmt w:val="lowerRoman"/>
+      <w:lvlText w:val="%6."/>
+      <w:lvlJc w:val="right"/>
+      <w:pPr>
+        <w:ind w:left="4320" w:hanging="180"/>
+      </w:pPr>
+    </w:lvl>
+    <w:lvl w:ilvl="6" w:tplc="FFFFFFFF" w:tentative="1">
+      <w:start w:val="1"/>
+      <w:numFmt w:val="decimal"/>
+      <w:lvlText w:val="%7."/>
+      <w:lvlJc w:val="left"/>
+      <w:pPr>
+        <w:ind w:left="5040" w:hanging="360"/>
+      </w:pPr>
+    </w:lvl>
+    <w:lvl w:ilvl="7" w:tplc="FFFFFFFF" w:tentative="1">
+      <w:start w:val="1"/>
+      <w:numFmt w:val="lowerLetter"/>
+      <w:lvlText w:val="%8."/>
+      <w:lvlJc w:val="left"/>
+      <w:pPr>
+        <w:ind w:left="5760" w:hanging="360"/>
+      </w:pPr>
+    </w:lvl>
+    <w:lvl w:ilvl="8" w:tplc="FFFFFFFF" w:tentative="1">
+      <w:start w:val="1"/>
+      <w:numFmt w:val="lowerRoman"/>
+      <w:lvlText w:val="%9."/>
+      <w:lvlJc w:val="right"/>
+      <w:pPr>
+        <w:ind w:left="6480" w:hanging="180"/>
+      </w:pPr>
+    </w:lvl>
+  </w:abstractNum>
+  <w:abstractNum w:abstractNumId="7" w15:restartNumberingAfterBreak="0">
     <w:nsid w:val="5844602D"/>
     <w:multiLevelType w:val="hybridMultilevel"/>
     <w:tmpl w:val="AF6E8432"/>
@@ -3386,19 +3954,25 @@
     <w:abstractNumId w:val="0"/>
   </w:num>
   <w:num w:numId="2" w16cid:durableId="222722018">
-    <w:abstractNumId w:val="3"/>
+    <w:abstractNumId w:val="4"/>
   </w:num>
   <w:num w:numId="3" w16cid:durableId="1505169164">
-    <w:abstractNumId w:val="5"/>
+    <w:abstractNumId w:val="7"/>
   </w:num>
   <w:num w:numId="4" w16cid:durableId="1680964081">
-    <w:abstractNumId w:val="4"/>
+    <w:abstractNumId w:val="5"/>
   </w:num>
   <w:num w:numId="5" w16cid:durableId="2089038939">
     <w:abstractNumId w:val="1"/>
   </w:num>
   <w:num w:numId="6" w16cid:durableId="334311646">
     <w:abstractNumId w:val="2"/>
+  </w:num>
+  <w:num w:numId="7" w16cid:durableId="642809733">
+    <w:abstractNumId w:val="6"/>
+  </w:num>
+  <w:num w:numId="8" w16cid:durableId="202720801">
+    <w:abstractNumId w:val="3"/>
   </w:num>
 </w:numbering>
 </file>
@@ -4006,6 +4580,7 @@
   <w:style w:type="character" w:default="1" w:styleId="DefaultParagraphFont">
     <w:name w:val="Default Paragraph Font"/>
     <w:uiPriority w:val="1"/>
+    <w:semiHidden/>
     <w:unhideWhenUsed/>
   </w:style>
   <w:style w:type="table" w:default="1" w:styleId="TableNormal">

</xml_diff>